<commit_message>
Add finish and artwork research to the construction document
Co-Authored-By: Claude Opus 5.5 <noreply@anthropic.com>
</commit_message>
<xml_diff>
--- a/Construction Research.docx
+++ b/Construction Research.docx
@@ -1079,7 +1079,7 @@
           <w:b w:val="false"/>
           <w:bCs w:val="false"/>
         </w:rPr>
-        <w:t xml:space="preserve">Tayda's page blocked direct access, so those figures come from search summaries and may be out of date. It also isn't confirmed that Tayda drills the </w:t>
+        <w:t xml:space="preserve">Tayda's page blocked direct access, so those figures come from search summaries and may be out of date. Tayda publishes a print template for the </w:t>
       </w:r>
       <w:r>
         <w:rPr>
@@ -1093,7 +1093,7 @@
           <w:b w:val="false"/>
           <w:bCs w:val="false"/>
         </w:rPr>
-        <w:t xml:space="preserve">, the box Flashover uses.</w:t>
+        <w:t xml:space="preserve">, the box Flashover uses, and a forum user reports ordering custom drilling, powder coat and printing on that box from Tayda. Confirm this and the 1590BB price with Tayda directly.</w:t>
       </w:r>
     </w:p>
     <w:p>
@@ -1469,7 +1469,1913 @@
         <w:pStyle w:val="Heading1"/>
       </w:pPr>
       <w:r>
-        <w:t xml:space="preserve">Sources</w:t>
+        <w:t xml:space="preserve">Finish and artwork</w:t>
+      </w:r>
+    </w:p>
+    <w:p>
+      <w:pPr>
+        <w:spacing w:after="120"/>
+      </w:pPr>
+      <w:r>
+        <w:rPr>
+          <w:b/>
+          <w:bCs/>
+        </w:rPr>
+        <w:t xml:space="preserve">Artwork normally goes on last: drill the holes, apply the base finish, then print.</w:t>
+      </w:r>
+      <w:r>
+        <w:rPr>
+          <w:b w:val="false"/>
+          <w:bCs w:val="false"/>
+        </w:rPr>
+        <w:t xml:space="preserve"> One builder describes exactly that order, and a Tayda customer reports ordering all three together. Drilling a finished box risks chipping it, and a coating would bury any print underneath it. The exceptions are parts made separately, such as an overlay or faceplate, which are added at the end.</w:t>
+      </w:r>
+    </w:p>
+    <w:p>
+      <w:pPr>
+        <w:spacing w:after="120"/>
+      </w:pPr>
+      <w:r>
+        <w:rPr>
+          <w:b w:val="false"/>
+          <w:bCs w:val="false"/>
+        </w:rPr>
+        <w:t xml:space="preserve">The look comes from two choices: the base finish on the metal, and how the artwork goes on top. Most of this research comes from builder forums and vendor pages, not independent tests, so the durability claims are anecdotal.</w:t>
+      </w:r>
+    </w:p>
+    <w:p>
+      <w:pPr>
+        <w:keepNext/>
+        <w:spacing w:after="80" w:before="160"/>
+      </w:pPr>
+      <w:r>
+        <w:rPr>
+          <w:b/>
+          <w:bCs/>
+        </w:rPr>
+        <w:t xml:space="preserve">Base finish</w:t>
+      </w:r>
+    </w:p>
+    <w:tbl>
+      <w:tblPr>
+        <w:tblW w:type="dxa" w:w="9360"/>
+        <w:tblBorders>
+          <w:top w:val="single" w:color="auto" w:sz="4"/>
+          <w:left w:val="single" w:color="auto" w:sz="4"/>
+          <w:bottom w:val="single" w:color="auto" w:sz="4"/>
+          <w:right w:val="single" w:color="auto" w:sz="4"/>
+          <w:insideH w:val="single" w:color="auto" w:sz="4"/>
+          <w:insideV w:val="single" w:color="auto" w:sz="4"/>
+        </w:tblBorders>
+      </w:tblPr>
+      <w:tblGrid>
+        <w:gridCol w:w="1600"/>
+        <w:gridCol w:w="2660"/>
+        <w:gridCol w:w="2500"/>
+        <w:gridCol w:w="2600"/>
+      </w:tblGrid>
+      <w:tr>
+        <w:trPr>
+          <w:tblHeader/>
+        </w:trPr>
+        <w:tc>
+          <w:tcPr>
+            <w:tcW w:type="dxa" w:w="1600"/>
+            <w:tcBorders>
+              <w:top w:val="single" w:color="BFC3C9" w:sz="4"/>
+              <w:left w:val="single" w:color="BFC3C9" w:sz="4"/>
+              <w:bottom w:val="single" w:color="BFC3C9" w:sz="4"/>
+              <w:right w:val="single" w:color="BFC3C9" w:sz="4"/>
+            </w:tcBorders>
+            <w:shd w:fill="3A3F47" w:color="auto" w:val="clear"/>
+            <w:tcMar>
+              <w:top w:type="dxa" w:w="60"/>
+              <w:left w:type="dxa" w:w="90"/>
+              <w:bottom w:type="dxa" w:w="60"/>
+              <w:right w:type="dxa" w:w="90"/>
+            </w:tcMar>
+          </w:tcPr>
+          <w:p>
+            <w:r>
+              <w:rPr>
+                <w:b/>
+                <w:bCs/>
+                <w:color w:val="FFFFFF"/>
+                <w:sz w:val="20"/>
+                <w:szCs w:val="20"/>
+              </w:rPr>
+              <w:t xml:space="preserve">Finish</w:t>
+            </w:r>
+          </w:p>
+        </w:tc>
+        <w:tc>
+          <w:tcPr>
+            <w:tcW w:type="dxa" w:w="2660"/>
+            <w:tcBorders>
+              <w:top w:val="single" w:color="BFC3C9" w:sz="4"/>
+              <w:left w:val="single" w:color="BFC3C9" w:sz="4"/>
+              <w:bottom w:val="single" w:color="BFC3C9" w:sz="4"/>
+              <w:right w:val="single" w:color="BFC3C9" w:sz="4"/>
+            </w:tcBorders>
+            <w:shd w:fill="3A3F47" w:color="auto" w:val="clear"/>
+            <w:tcMar>
+              <w:top w:type="dxa" w:w="60"/>
+              <w:left w:type="dxa" w:w="90"/>
+              <w:bottom w:type="dxa" w:w="60"/>
+              <w:right w:type="dxa" w:w="90"/>
+            </w:tcMar>
+          </w:tcPr>
+          <w:p>
+            <w:r>
+              <w:rPr>
+                <w:b/>
+                <w:bCs/>
+                <w:color w:val="FFFFFF"/>
+                <w:sz w:val="20"/>
+                <w:szCs w:val="20"/>
+              </w:rPr>
+              <w:t xml:space="preserve">How it works</w:t>
+            </w:r>
+          </w:p>
+        </w:tc>
+        <w:tc>
+          <w:tcPr>
+            <w:tcW w:type="dxa" w:w="2500"/>
+            <w:tcBorders>
+              <w:top w:val="single" w:color="BFC3C9" w:sz="4"/>
+              <w:left w:val="single" w:color="BFC3C9" w:sz="4"/>
+              <w:bottom w:val="single" w:color="BFC3C9" w:sz="4"/>
+              <w:right w:val="single" w:color="BFC3C9" w:sz="4"/>
+            </w:tcBorders>
+            <w:shd w:fill="3A3F47" w:color="auto" w:val="clear"/>
+            <w:tcMar>
+              <w:top w:type="dxa" w:w="60"/>
+              <w:left w:type="dxa" w:w="90"/>
+              <w:bottom w:type="dxa" w:w="60"/>
+              <w:right w:type="dxa" w:w="90"/>
+            </w:tcMar>
+          </w:tcPr>
+          <w:p>
+            <w:r>
+              <w:rPr>
+                <w:b/>
+                <w:bCs/>
+                <w:color w:val="FFFFFF"/>
+                <w:sz w:val="20"/>
+                <w:szCs w:val="20"/>
+              </w:rPr>
+              <w:t xml:space="preserve">Cost and minimums</w:t>
+            </w:r>
+          </w:p>
+        </w:tc>
+        <w:tc>
+          <w:tcPr>
+            <w:tcW w:type="dxa" w:w="2600"/>
+            <w:tcBorders>
+              <w:top w:val="single" w:color="BFC3C9" w:sz="4"/>
+              <w:left w:val="single" w:color="BFC3C9" w:sz="4"/>
+              <w:bottom w:val="single" w:color="BFC3C9" w:sz="4"/>
+              <w:right w:val="single" w:color="BFC3C9" w:sz="4"/>
+            </w:tcBorders>
+            <w:shd w:fill="3A3F47" w:color="auto" w:val="clear"/>
+            <w:tcMar>
+              <w:top w:type="dxa" w:w="60"/>
+              <w:left w:type="dxa" w:w="90"/>
+              <w:bottom w:type="dxa" w:w="60"/>
+              <w:right w:type="dxa" w:w="90"/>
+            </w:tcMar>
+          </w:tcPr>
+          <w:p>
+            <w:r>
+              <w:rPr>
+                <w:b/>
+                <w:bCs/>
+                <w:color w:val="FFFFFF"/>
+                <w:sz w:val="20"/>
+                <w:szCs w:val="20"/>
+              </w:rPr>
+              <w:t xml:space="preserve">Durability and catch</w:t>
+            </w:r>
+          </w:p>
+        </w:tc>
+      </w:tr>
+      <w:tr>
+        <w:trPr>
+          <w:cantSplit/>
+        </w:trPr>
+        <w:tc>
+          <w:tcPr>
+            <w:tcW w:type="dxa" w:w="1600"/>
+            <w:tcBorders>
+              <w:top w:val="single" w:color="BFC3C9" w:sz="4"/>
+              <w:left w:val="single" w:color="BFC3C9" w:sz="4"/>
+              <w:bottom w:val="single" w:color="BFC3C9" w:sz="4"/>
+              <w:right w:val="single" w:color="BFC3C9" w:sz="4"/>
+            </w:tcBorders>
+            <w:tcMar>
+              <w:top w:type="dxa" w:w="60"/>
+              <w:left w:type="dxa" w:w="90"/>
+              <w:bottom w:type="dxa" w:w="60"/>
+              <w:right w:type="dxa" w:w="90"/>
+            </w:tcMar>
+          </w:tcPr>
+          <w:p>
+            <w:r>
+              <w:rPr>
+                <w:b w:val="false"/>
+                <w:bCs w:val="false"/>
+                <w:sz w:val="20"/>
+                <w:szCs w:val="20"/>
+              </w:rPr>
+              <w:t xml:space="preserve">Bare or brushed</w:t>
+            </w:r>
+          </w:p>
+        </w:tc>
+        <w:tc>
+          <w:tcPr>
+            <w:tcW w:type="dxa" w:w="2660"/>
+            <w:tcBorders>
+              <w:top w:val="single" w:color="BFC3C9" w:sz="4"/>
+              <w:left w:val="single" w:color="BFC3C9" w:sz="4"/>
+              <w:bottom w:val="single" w:color="BFC3C9" w:sz="4"/>
+              <w:right w:val="single" w:color="BFC3C9" w:sz="4"/>
+            </w:tcBorders>
+            <w:tcMar>
+              <w:top w:type="dxa" w:w="60"/>
+              <w:left w:type="dxa" w:w="90"/>
+              <w:bottom w:type="dxa" w:w="60"/>
+              <w:right w:type="dxa" w:w="90"/>
+            </w:tcMar>
+          </w:tcPr>
+          <w:p>
+            <w:r>
+              <w:rPr>
+                <w:b w:val="false"/>
+                <w:bCs w:val="false"/>
+                <w:sz w:val="20"/>
+                <w:szCs w:val="20"/>
+              </w:rPr>
+              <w:t xml:space="preserve">Leave the aluminium plain, or sand it and add varnish</w:t>
+            </w:r>
+          </w:p>
+        </w:tc>
+        <w:tc>
+          <w:tcPr>
+            <w:tcW w:type="dxa" w:w="2500"/>
+            <w:tcBorders>
+              <w:top w:val="single" w:color="BFC3C9" w:sz="4"/>
+              <w:left w:val="single" w:color="BFC3C9" w:sz="4"/>
+              <w:bottom w:val="single" w:color="BFC3C9" w:sz="4"/>
+              <w:right w:val="single" w:color="BFC3C9" w:sz="4"/>
+            </w:tcBorders>
+            <w:tcMar>
+              <w:top w:type="dxa" w:w="60"/>
+              <w:left w:type="dxa" w:w="90"/>
+              <w:bottom w:type="dxa" w:w="60"/>
+              <w:right w:type="dxa" w:w="90"/>
+            </w:tcMar>
+          </w:tcPr>
+          <w:p>
+            <w:r>
+              <w:rPr>
+                <w:b w:val="false"/>
+                <w:bCs w:val="false"/>
+                <w:sz w:val="20"/>
+                <w:szCs w:val="20"/>
+              </w:rPr>
+              <w:t xml:space="preserve">Cheap, with no minimum</w:t>
+            </w:r>
+          </w:p>
+        </w:tc>
+        <w:tc>
+          <w:tcPr>
+            <w:tcW w:type="dxa" w:w="2600"/>
+            <w:tcBorders>
+              <w:top w:val="single" w:color="BFC3C9" w:sz="4"/>
+              <w:left w:val="single" w:color="BFC3C9" w:sz="4"/>
+              <w:bottom w:val="single" w:color="BFC3C9" w:sz="4"/>
+              <w:right w:val="single" w:color="BFC3C9" w:sz="4"/>
+            </w:tcBorders>
+            <w:tcMar>
+              <w:top w:type="dxa" w:w="60"/>
+              <w:left w:type="dxa" w:w="90"/>
+              <w:bottom w:type="dxa" w:w="60"/>
+              <w:right w:type="dxa" w:w="90"/>
+            </w:tcMar>
+          </w:tcPr>
+          <w:p>
+            <w:r>
+              <w:rPr>
+                <w:b w:val="false"/>
+                <w:bCs w:val="false"/>
+                <w:sz w:val="20"/>
+                <w:szCs w:val="20"/>
+              </w:rPr>
+              <w:t xml:space="preserve">Bare looks unfinished. A polished finish takes time</w:t>
+            </w:r>
+          </w:p>
+        </w:tc>
+      </w:tr>
+      <w:tr>
+        <w:trPr>
+          <w:cantSplit/>
+        </w:trPr>
+        <w:tc>
+          <w:tcPr>
+            <w:tcW w:type="dxa" w:w="1600"/>
+            <w:tcBorders>
+              <w:top w:val="single" w:color="BFC3C9" w:sz="4"/>
+              <w:left w:val="single" w:color="BFC3C9" w:sz="4"/>
+              <w:bottom w:val="single" w:color="BFC3C9" w:sz="4"/>
+              <w:right w:val="single" w:color="BFC3C9" w:sz="4"/>
+            </w:tcBorders>
+            <w:tcMar>
+              <w:top w:type="dxa" w:w="60"/>
+              <w:left w:type="dxa" w:w="90"/>
+              <w:bottom w:type="dxa" w:w="60"/>
+              <w:right w:type="dxa" w:w="90"/>
+            </w:tcMar>
+          </w:tcPr>
+          <w:p>
+            <w:r>
+              <w:rPr>
+                <w:b w:val="false"/>
+                <w:bCs w:val="false"/>
+                <w:sz w:val="20"/>
+                <w:szCs w:val="20"/>
+              </w:rPr>
+              <w:t xml:space="preserve">Spray paint or hammertone</w:t>
+            </w:r>
+          </w:p>
+        </w:tc>
+        <w:tc>
+          <w:tcPr>
+            <w:tcW w:type="dxa" w:w="2660"/>
+            <w:tcBorders>
+              <w:top w:val="single" w:color="BFC3C9" w:sz="4"/>
+              <w:left w:val="single" w:color="BFC3C9" w:sz="4"/>
+              <w:bottom w:val="single" w:color="BFC3C9" w:sz="4"/>
+              <w:right w:val="single" w:color="BFC3C9" w:sz="4"/>
+            </w:tcBorders>
+            <w:tcMar>
+              <w:top w:type="dxa" w:w="60"/>
+              <w:left w:type="dxa" w:w="90"/>
+              <w:bottom w:type="dxa" w:w="60"/>
+              <w:right w:type="dxa" w:w="90"/>
+            </w:tcMar>
+          </w:tcPr>
+          <w:p>
+            <w:r>
+              <w:rPr>
+                <w:b w:val="false"/>
+                <w:bCs w:val="false"/>
+                <w:sz w:val="20"/>
+                <w:szCs w:val="20"/>
+              </w:rPr>
+              <w:t xml:space="preserve">Thin sprayed coats; hammertone gives a textured vintage look</w:t>
+            </w:r>
+          </w:p>
+        </w:tc>
+        <w:tc>
+          <w:tcPr>
+            <w:tcW w:type="dxa" w:w="2500"/>
+            <w:tcBorders>
+              <w:top w:val="single" w:color="BFC3C9" w:sz="4"/>
+              <w:left w:val="single" w:color="BFC3C9" w:sz="4"/>
+              <w:bottom w:val="single" w:color="BFC3C9" w:sz="4"/>
+              <w:right w:val="single" w:color="BFC3C9" w:sz="4"/>
+            </w:tcBorders>
+            <w:tcMar>
+              <w:top w:type="dxa" w:w="60"/>
+              <w:left w:type="dxa" w:w="90"/>
+              <w:bottom w:type="dxa" w:w="60"/>
+              <w:right w:type="dxa" w:w="90"/>
+            </w:tcMar>
+          </w:tcPr>
+          <w:p>
+            <w:r>
+              <w:rPr>
+                <w:b w:val="false"/>
+                <w:bCs w:val="false"/>
+                <w:sz w:val="20"/>
+                <w:szCs w:val="20"/>
+              </w:rPr>
+              <w:t xml:space="preserve">About 12 euros a can, with no minimum</w:t>
+            </w:r>
+          </w:p>
+        </w:tc>
+        <w:tc>
+          <w:tcPr>
+            <w:tcW w:type="dxa" w:w="2600"/>
+            <w:tcBorders>
+              <w:top w:val="single" w:color="BFC3C9" w:sz="4"/>
+              <w:left w:val="single" w:color="BFC3C9" w:sz="4"/>
+              <w:bottom w:val="single" w:color="BFC3C9" w:sz="4"/>
+              <w:right w:val="single" w:color="BFC3C9" w:sz="4"/>
+            </w:tcBorders>
+            <w:tcMar>
+              <w:top w:type="dxa" w:w="60"/>
+              <w:left w:type="dxa" w:w="90"/>
+              <w:bottom w:type="dxa" w:w="60"/>
+              <w:right w:type="dxa" w:w="90"/>
+            </w:tcMar>
+          </w:tcPr>
+          <w:p>
+            <w:r>
+              <w:rPr>
+                <w:b w:val="false"/>
+                <w:bCs w:val="false"/>
+                <w:sz w:val="20"/>
+                <w:szCs w:val="20"/>
+              </w:rPr>
+              <w:t xml:space="preserve">Plain paint scratches and wears easily, and hammertone holds up better. Both are slow and need a mask and outdoor spraying</w:t>
+            </w:r>
+          </w:p>
+        </w:tc>
+      </w:tr>
+      <w:tr>
+        <w:trPr>
+          <w:cantSplit/>
+        </w:trPr>
+        <w:tc>
+          <w:tcPr>
+            <w:tcW w:type="dxa" w:w="1600"/>
+            <w:tcBorders>
+              <w:top w:val="single" w:color="BFC3C9" w:sz="4"/>
+              <w:left w:val="single" w:color="BFC3C9" w:sz="4"/>
+              <w:bottom w:val="single" w:color="BFC3C9" w:sz="4"/>
+              <w:right w:val="single" w:color="BFC3C9" w:sz="4"/>
+            </w:tcBorders>
+            <w:tcMar>
+              <w:top w:type="dxa" w:w="60"/>
+              <w:left w:type="dxa" w:w="90"/>
+              <w:bottom w:type="dxa" w:w="60"/>
+              <w:right w:type="dxa" w:w="90"/>
+            </w:tcMar>
+          </w:tcPr>
+          <w:p>
+            <w:r>
+              <w:rPr>
+                <w:b w:val="false"/>
+                <w:bCs w:val="false"/>
+                <w:sz w:val="20"/>
+                <w:szCs w:val="20"/>
+              </w:rPr>
+              <w:t xml:space="preserve">Powder coat</w:t>
+            </w:r>
+          </w:p>
+        </w:tc>
+        <w:tc>
+          <w:tcPr>
+            <w:tcW w:type="dxa" w:w="2660"/>
+            <w:tcBorders>
+              <w:top w:val="single" w:color="BFC3C9" w:sz="4"/>
+              <w:left w:val="single" w:color="BFC3C9" w:sz="4"/>
+              <w:bottom w:val="single" w:color="BFC3C9" w:sz="4"/>
+              <w:right w:val="single" w:color="BFC3C9" w:sz="4"/>
+            </w:tcBorders>
+            <w:tcMar>
+              <w:top w:type="dxa" w:w="60"/>
+              <w:left w:type="dxa" w:w="90"/>
+              <w:bottom w:type="dxa" w:w="60"/>
+              <w:right w:type="dxa" w:w="90"/>
+            </w:tcMar>
+          </w:tcPr>
+          <w:p>
+            <w:r>
+              <w:rPr>
+                <w:b w:val="false"/>
+                <w:bCs w:val="false"/>
+                <w:sz w:val="20"/>
+                <w:szCs w:val="20"/>
+              </w:rPr>
+              <w:t xml:space="preserve">A charged powder is sprayed on and baked</w:t>
+            </w:r>
+          </w:p>
+        </w:tc>
+        <w:tc>
+          <w:tcPr>
+            <w:tcW w:type="dxa" w:w="2500"/>
+            <w:tcBorders>
+              <w:top w:val="single" w:color="BFC3C9" w:sz="4"/>
+              <w:left w:val="single" w:color="BFC3C9" w:sz="4"/>
+              <w:bottom w:val="single" w:color="BFC3C9" w:sz="4"/>
+              <w:right w:val="single" w:color="BFC3C9" w:sz="4"/>
+            </w:tcBorders>
+            <w:tcMar>
+              <w:top w:type="dxa" w:w="60"/>
+              <w:left w:type="dxa" w:w="90"/>
+              <w:bottom w:type="dxa" w:w="60"/>
+              <w:right w:type="dxa" w:w="90"/>
+            </w:tcMar>
+          </w:tcPr>
+          <w:p>
+            <w:r>
+              <w:rPr>
+                <w:b w:val="false"/>
+                <w:bCs w:val="false"/>
+                <w:sz w:val="20"/>
+                <w:szCs w:val="20"/>
+              </w:rPr>
+              <w:t xml:space="preserve">Pre-coated boxes cost about 3–4 euros more than bare ones. One builder says coaters often want 50 boxes; StompBoxParts quotes about 25 for special colours. A home setup is a $50–60 gun plus an oven</w:t>
+            </w:r>
+          </w:p>
+        </w:tc>
+        <w:tc>
+          <w:tcPr>
+            <w:tcW w:type="dxa" w:w="2600"/>
+            <w:tcBorders>
+              <w:top w:val="single" w:color="BFC3C9" w:sz="4"/>
+              <w:left w:val="single" w:color="BFC3C9" w:sz="4"/>
+              <w:bottom w:val="single" w:color="BFC3C9" w:sz="4"/>
+              <w:right w:val="single" w:color="BFC3C9" w:sz="4"/>
+            </w:tcBorders>
+            <w:tcMar>
+              <w:top w:type="dxa" w:w="60"/>
+              <w:left w:type="dxa" w:w="90"/>
+              <w:bottom w:type="dxa" w:w="60"/>
+              <w:right w:type="dxa" w:w="90"/>
+            </w:tcMar>
+          </w:tcPr>
+          <w:p>
+            <w:r>
+              <w:rPr>
+                <w:b w:val="false"/>
+                <w:bCs w:val="false"/>
+                <w:sz w:val="20"/>
+                <w:szCs w:val="20"/>
+              </w:rPr>
+              <w:t xml:space="preserve">Hard, shiny and durable. Narrows the holes, and a forum tip is to add 0.2 mm to every hole</w:t>
+            </w:r>
+          </w:p>
+        </w:tc>
+      </w:tr>
+      <w:tr>
+        <w:trPr>
+          <w:cantSplit/>
+        </w:trPr>
+        <w:tc>
+          <w:tcPr>
+            <w:tcW w:type="dxa" w:w="1600"/>
+            <w:tcBorders>
+              <w:top w:val="single" w:color="BFC3C9" w:sz="4"/>
+              <w:left w:val="single" w:color="BFC3C9" w:sz="4"/>
+              <w:bottom w:val="single" w:color="BFC3C9" w:sz="4"/>
+              <w:right w:val="single" w:color="BFC3C9" w:sz="4"/>
+            </w:tcBorders>
+            <w:tcMar>
+              <w:top w:type="dxa" w:w="60"/>
+              <w:left w:type="dxa" w:w="90"/>
+              <w:bottom w:type="dxa" w:w="60"/>
+              <w:right w:type="dxa" w:w="90"/>
+            </w:tcMar>
+          </w:tcPr>
+          <w:p>
+            <w:r>
+              <w:rPr>
+                <w:b/>
+                <w:bCs/>
+                <w:sz w:val="20"/>
+                <w:szCs w:val="20"/>
+              </w:rPr>
+              <w:t xml:space="preserve">Anodizing</w:t>
+            </w:r>
+          </w:p>
+        </w:tc>
+        <w:tc>
+          <w:tcPr>
+            <w:tcW w:type="dxa" w:w="2660"/>
+            <w:tcBorders>
+              <w:top w:val="single" w:color="BFC3C9" w:sz="4"/>
+              <w:left w:val="single" w:color="BFC3C9" w:sz="4"/>
+              <w:bottom w:val="single" w:color="BFC3C9" w:sz="4"/>
+              <w:right w:val="single" w:color="BFC3C9" w:sz="4"/>
+            </w:tcBorders>
+            <w:tcMar>
+              <w:top w:type="dxa" w:w="60"/>
+              <w:left w:type="dxa" w:w="90"/>
+              <w:bottom w:type="dxa" w:w="60"/>
+              <w:right w:type="dxa" w:w="90"/>
+            </w:tcMar>
+          </w:tcPr>
+          <w:p>
+            <w:r>
+              <w:rPr>
+                <w:b w:val="false"/>
+                <w:bCs w:val="false"/>
+                <w:sz w:val="20"/>
+                <w:szCs w:val="20"/>
+              </w:rPr>
+              <w:t xml:space="preserve">A chemical treatment that colours the metal's surface</w:t>
+            </w:r>
+          </w:p>
+        </w:tc>
+        <w:tc>
+          <w:tcPr>
+            <w:tcW w:type="dxa" w:w="2500"/>
+            <w:tcBorders>
+              <w:top w:val="single" w:color="BFC3C9" w:sz="4"/>
+              <w:left w:val="single" w:color="BFC3C9" w:sz="4"/>
+              <w:bottom w:val="single" w:color="BFC3C9" w:sz="4"/>
+              <w:right w:val="single" w:color="BFC3C9" w:sz="4"/>
+            </w:tcBorders>
+            <w:tcMar>
+              <w:top w:type="dxa" w:w="60"/>
+              <w:left w:type="dxa" w:w="90"/>
+              <w:bottom w:type="dxa" w:w="60"/>
+              <w:right w:type="dxa" w:w="90"/>
+            </w:tcMar>
+          </w:tcPr>
+          <w:p>
+            <w:r>
+              <w:rPr>
+                <w:b w:val="false"/>
+                <w:bCs w:val="false"/>
+                <w:sz w:val="20"/>
+                <w:szCs w:val="20"/>
+              </w:rPr>
+              <w:t xml:space="preserve">No pedal-specific price found</w:t>
+            </w:r>
+          </w:p>
+        </w:tc>
+        <w:tc>
+          <w:tcPr>
+            <w:tcW w:type="dxa" w:w="2600"/>
+            <w:tcBorders>
+              <w:top w:val="single" w:color="BFC3C9" w:sz="4"/>
+              <w:left w:val="single" w:color="BFC3C9" w:sz="4"/>
+              <w:bottom w:val="single" w:color="BFC3C9" w:sz="4"/>
+              <w:right w:val="single" w:color="BFC3C9" w:sz="4"/>
+            </w:tcBorders>
+            <w:tcMar>
+              <w:top w:type="dxa" w:w="60"/>
+              <w:left w:type="dxa" w:w="90"/>
+              <w:bottom w:type="dxa" w:w="60"/>
+              <w:right w:type="dxa" w:w="90"/>
+            </w:tcMar>
+          </w:tcPr>
+          <w:p>
+            <w:r>
+              <w:rPr>
+                <w:b w:val="false"/>
+                <w:bCs w:val="false"/>
+                <w:sz w:val="20"/>
+                <w:szCs w:val="20"/>
+              </w:rPr>
+              <w:t xml:space="preserve">Pairs well with laser marking, and the mark is permanent. Not researched further for die-cast boxes, so ask a supplier</w:t>
+            </w:r>
+          </w:p>
+        </w:tc>
+      </w:tr>
+    </w:tbl>
+    <w:p>
+      <w:pPr>
+        <w:keepNext/>
+        <w:spacing w:after="80" w:before="200"/>
+      </w:pPr>
+      <w:r>
+        <w:rPr>
+          <w:b/>
+          <w:bCs/>
+        </w:rPr>
+        <w:t xml:space="preserve">Artwork</w:t>
+      </w:r>
+    </w:p>
+    <w:tbl>
+      <w:tblPr>
+        <w:tblW w:type="dxa" w:w="9360"/>
+        <w:tblBorders>
+          <w:top w:val="single" w:color="auto" w:sz="4"/>
+          <w:left w:val="single" w:color="auto" w:sz="4"/>
+          <w:bottom w:val="single" w:color="auto" w:sz="4"/>
+          <w:right w:val="single" w:color="auto" w:sz="4"/>
+          <w:insideH w:val="single" w:color="auto" w:sz="4"/>
+          <w:insideV w:val="single" w:color="auto" w:sz="4"/>
+        </w:tblBorders>
+      </w:tblPr>
+      <w:tblGrid>
+        <w:gridCol w:w="1600"/>
+        <w:gridCol w:w="2660"/>
+        <w:gridCol w:w="2500"/>
+        <w:gridCol w:w="2600"/>
+      </w:tblGrid>
+      <w:tr>
+        <w:trPr>
+          <w:tblHeader/>
+        </w:trPr>
+        <w:tc>
+          <w:tcPr>
+            <w:tcW w:type="dxa" w:w="1600"/>
+            <w:tcBorders>
+              <w:top w:val="single" w:color="BFC3C9" w:sz="4"/>
+              <w:left w:val="single" w:color="BFC3C9" w:sz="4"/>
+              <w:bottom w:val="single" w:color="BFC3C9" w:sz="4"/>
+              <w:right w:val="single" w:color="BFC3C9" w:sz="4"/>
+            </w:tcBorders>
+            <w:shd w:fill="3A3F47" w:color="auto" w:val="clear"/>
+            <w:tcMar>
+              <w:top w:type="dxa" w:w="60"/>
+              <w:left w:type="dxa" w:w="90"/>
+              <w:bottom w:type="dxa" w:w="60"/>
+              <w:right w:type="dxa" w:w="90"/>
+            </w:tcMar>
+          </w:tcPr>
+          <w:p>
+            <w:r>
+              <w:rPr>
+                <w:b/>
+                <w:bCs/>
+                <w:color w:val="FFFFFF"/>
+                <w:sz w:val="20"/>
+                <w:szCs w:val="20"/>
+              </w:rPr>
+              <w:t xml:space="preserve">Method</w:t>
+            </w:r>
+          </w:p>
+        </w:tc>
+        <w:tc>
+          <w:tcPr>
+            <w:tcW w:type="dxa" w:w="2660"/>
+            <w:tcBorders>
+              <w:top w:val="single" w:color="BFC3C9" w:sz="4"/>
+              <w:left w:val="single" w:color="BFC3C9" w:sz="4"/>
+              <w:bottom w:val="single" w:color="BFC3C9" w:sz="4"/>
+              <w:right w:val="single" w:color="BFC3C9" w:sz="4"/>
+            </w:tcBorders>
+            <w:shd w:fill="3A3F47" w:color="auto" w:val="clear"/>
+            <w:tcMar>
+              <w:top w:type="dxa" w:w="60"/>
+              <w:left w:type="dxa" w:w="90"/>
+              <w:bottom w:type="dxa" w:w="60"/>
+              <w:right w:type="dxa" w:w="90"/>
+            </w:tcMar>
+          </w:tcPr>
+          <w:p>
+            <w:r>
+              <w:rPr>
+                <w:b/>
+                <w:bCs/>
+                <w:color w:val="FFFFFF"/>
+                <w:sz w:val="20"/>
+                <w:szCs w:val="20"/>
+              </w:rPr>
+              <w:t xml:space="preserve">How it works</w:t>
+            </w:r>
+          </w:p>
+        </w:tc>
+        <w:tc>
+          <w:tcPr>
+            <w:tcW w:type="dxa" w:w="2500"/>
+            <w:tcBorders>
+              <w:top w:val="single" w:color="BFC3C9" w:sz="4"/>
+              <w:left w:val="single" w:color="BFC3C9" w:sz="4"/>
+              <w:bottom w:val="single" w:color="BFC3C9" w:sz="4"/>
+              <w:right w:val="single" w:color="BFC3C9" w:sz="4"/>
+            </w:tcBorders>
+            <w:shd w:fill="3A3F47" w:color="auto" w:val="clear"/>
+            <w:tcMar>
+              <w:top w:type="dxa" w:w="60"/>
+              <w:left w:type="dxa" w:w="90"/>
+              <w:bottom w:type="dxa" w:w="60"/>
+              <w:right w:type="dxa" w:w="90"/>
+            </w:tcMar>
+          </w:tcPr>
+          <w:p>
+            <w:r>
+              <w:rPr>
+                <w:b/>
+                <w:bCs/>
+                <w:color w:val="FFFFFF"/>
+                <w:sz w:val="20"/>
+                <w:szCs w:val="20"/>
+              </w:rPr>
+              <w:t xml:space="preserve">Cost and minimums</w:t>
+            </w:r>
+          </w:p>
+        </w:tc>
+        <w:tc>
+          <w:tcPr>
+            <w:tcW w:type="dxa" w:w="2600"/>
+            <w:tcBorders>
+              <w:top w:val="single" w:color="BFC3C9" w:sz="4"/>
+              <w:left w:val="single" w:color="BFC3C9" w:sz="4"/>
+              <w:bottom w:val="single" w:color="BFC3C9" w:sz="4"/>
+              <w:right w:val="single" w:color="BFC3C9" w:sz="4"/>
+            </w:tcBorders>
+            <w:shd w:fill="3A3F47" w:color="auto" w:val="clear"/>
+            <w:tcMar>
+              <w:top w:type="dxa" w:w="60"/>
+              <w:left w:type="dxa" w:w="90"/>
+              <w:bottom w:type="dxa" w:w="60"/>
+              <w:right w:type="dxa" w:w="90"/>
+            </w:tcMar>
+          </w:tcPr>
+          <w:p>
+            <w:r>
+              <w:rPr>
+                <w:b/>
+                <w:bCs/>
+                <w:color w:val="FFFFFF"/>
+                <w:sz w:val="20"/>
+                <w:szCs w:val="20"/>
+              </w:rPr>
+              <w:t xml:space="preserve">Durability and catch</w:t>
+            </w:r>
+          </w:p>
+        </w:tc>
+      </w:tr>
+      <w:tr>
+        <w:trPr>
+          <w:cantSplit/>
+        </w:trPr>
+        <w:tc>
+          <w:tcPr>
+            <w:tcW w:type="dxa" w:w="1600"/>
+            <w:tcBorders>
+              <w:top w:val="single" w:color="BFC3C9" w:sz="4"/>
+              <w:left w:val="single" w:color="BFC3C9" w:sz="4"/>
+              <w:bottom w:val="single" w:color="BFC3C9" w:sz="4"/>
+              <w:right w:val="single" w:color="BFC3C9" w:sz="4"/>
+            </w:tcBorders>
+            <w:tcMar>
+              <w:top w:type="dxa" w:w="60"/>
+              <w:left w:type="dxa" w:w="90"/>
+              <w:bottom w:type="dxa" w:w="60"/>
+              <w:right w:type="dxa" w:w="90"/>
+            </w:tcMar>
+          </w:tcPr>
+          <w:p>
+            <w:r>
+              <w:rPr>
+                <w:b w:val="false"/>
+                <w:bCs w:val="false"/>
+                <w:sz w:val="20"/>
+                <w:szCs w:val="20"/>
+              </w:rPr>
+              <w:t xml:space="preserve">UV printing</w:t>
+            </w:r>
+          </w:p>
+        </w:tc>
+        <w:tc>
+          <w:tcPr>
+            <w:tcW w:type="dxa" w:w="2660"/>
+            <w:tcBorders>
+              <w:top w:val="single" w:color="BFC3C9" w:sz="4"/>
+              <w:left w:val="single" w:color="BFC3C9" w:sz="4"/>
+              <w:bottom w:val="single" w:color="BFC3C9" w:sz="4"/>
+              <w:right w:val="single" w:color="BFC3C9" w:sz="4"/>
+            </w:tcBorders>
+            <w:tcMar>
+              <w:top w:type="dxa" w:w="60"/>
+              <w:left w:type="dxa" w:w="90"/>
+              <w:bottom w:type="dxa" w:w="60"/>
+              <w:right w:type="dxa" w:w="90"/>
+            </w:tcMar>
+          </w:tcPr>
+          <w:p>
+            <w:r>
+              <w:rPr>
+                <w:b w:val="false"/>
+                <w:bCs w:val="false"/>
+                <w:sz w:val="20"/>
+                <w:szCs w:val="20"/>
+              </w:rPr>
+              <w:t xml:space="preserve">An inkjet machine prints directly on the box, in any colours, and UV light hardens the ink</w:t>
+            </w:r>
+          </w:p>
+        </w:tc>
+        <w:tc>
+          <w:tcPr>
+            <w:tcW w:type="dxa" w:w="2500"/>
+            <w:tcBorders>
+              <w:top w:val="single" w:color="BFC3C9" w:sz="4"/>
+              <w:left w:val="single" w:color="BFC3C9" w:sz="4"/>
+              <w:bottom w:val="single" w:color="BFC3C9" w:sz="4"/>
+              <w:right w:val="single" w:color="BFC3C9" w:sz="4"/>
+            </w:tcBorders>
+            <w:tcMar>
+              <w:top w:type="dxa" w:w="60"/>
+              <w:left w:type="dxa" w:w="90"/>
+              <w:bottom w:type="dxa" w:w="60"/>
+              <w:right w:type="dxa" w:w="90"/>
+            </w:tcMar>
+          </w:tcPr>
+          <w:p>
+            <w:r>
+              <w:rPr>
+                <w:b w:val="false"/>
+                <w:bCs w:val="false"/>
+                <w:sz w:val="20"/>
+                <w:szCs w:val="20"/>
+              </w:rPr>
+              <w:t xml:space="preserve">A forum post says Tayda charges about $4 a box plus $2 for gloss, which may be dated. Small orders are fine. A machine costs thousands of dollars or more</w:t>
+            </w:r>
+          </w:p>
+        </w:tc>
+        <w:tc>
+          <w:tcPr>
+            <w:tcW w:type="dxa" w:w="2600"/>
+            <w:tcBorders>
+              <w:top w:val="single" w:color="BFC3C9" w:sz="4"/>
+              <w:left w:val="single" w:color="BFC3C9" w:sz="4"/>
+              <w:bottom w:val="single" w:color="BFC3C9" w:sz="4"/>
+              <w:right w:val="single" w:color="BFC3C9" w:sz="4"/>
+            </w:tcBorders>
+            <w:tcMar>
+              <w:top w:type="dxa" w:w="60"/>
+              <w:left w:type="dxa" w:w="90"/>
+              <w:bottom w:type="dxa" w:w="60"/>
+              <w:right w:type="dxa" w:w="90"/>
+            </w:tcMar>
+          </w:tcPr>
+          <w:p>
+            <w:r>
+              <w:rPr>
+                <w:b w:val="false"/>
+                <w:bCs w:val="false"/>
+                <w:sz w:val="20"/>
+                <w:szCs w:val="20"/>
+              </w:rPr>
+              <w:t xml:space="preserve">Reported as durable. Tayda can't print gold or silver, and needs a white layer for colours on dark boxes</w:t>
+            </w:r>
+          </w:p>
+        </w:tc>
+      </w:tr>
+      <w:tr>
+        <w:trPr>
+          <w:cantSplit/>
+        </w:trPr>
+        <w:tc>
+          <w:tcPr>
+            <w:tcW w:type="dxa" w:w="1600"/>
+            <w:tcBorders>
+              <w:top w:val="single" w:color="BFC3C9" w:sz="4"/>
+              <w:left w:val="single" w:color="BFC3C9" w:sz="4"/>
+              <w:bottom w:val="single" w:color="BFC3C9" w:sz="4"/>
+              <w:right w:val="single" w:color="BFC3C9" w:sz="4"/>
+            </w:tcBorders>
+            <w:tcMar>
+              <w:top w:type="dxa" w:w="60"/>
+              <w:left w:type="dxa" w:w="90"/>
+              <w:bottom w:type="dxa" w:w="60"/>
+              <w:right w:type="dxa" w:w="90"/>
+            </w:tcMar>
+          </w:tcPr>
+          <w:p>
+            <w:r>
+              <w:rPr>
+                <w:b w:val="false"/>
+                <w:bCs w:val="false"/>
+                <w:sz w:val="20"/>
+                <w:szCs w:val="20"/>
+              </w:rPr>
+              <w:t xml:space="preserve">Screen printing</w:t>
+            </w:r>
+          </w:p>
+        </w:tc>
+        <w:tc>
+          <w:tcPr>
+            <w:tcW w:type="dxa" w:w="2660"/>
+            <w:tcBorders>
+              <w:top w:val="single" w:color="BFC3C9" w:sz="4"/>
+              <w:left w:val="single" w:color="BFC3C9" w:sz="4"/>
+              <w:bottom w:val="single" w:color="BFC3C9" w:sz="4"/>
+              <w:right w:val="single" w:color="BFC3C9" w:sz="4"/>
+            </w:tcBorders>
+            <w:tcMar>
+              <w:top w:type="dxa" w:w="60"/>
+              <w:left w:type="dxa" w:w="90"/>
+              <w:bottom w:type="dxa" w:w="60"/>
+              <w:right w:type="dxa" w:w="90"/>
+            </w:tcMar>
+          </w:tcPr>
+          <w:p>
+            <w:r>
+              <w:rPr>
+                <w:b w:val="false"/>
+                <w:bCs w:val="false"/>
+                <w:sz w:val="20"/>
+                <w:szCs w:val="20"/>
+              </w:rPr>
+              <w:t xml:space="preserve">Ink is pushed through a mesh screen, with one screen per colour</w:t>
+            </w:r>
+          </w:p>
+        </w:tc>
+        <w:tc>
+          <w:tcPr>
+            <w:tcW w:type="dxa" w:w="2500"/>
+            <w:tcBorders>
+              <w:top w:val="single" w:color="BFC3C9" w:sz="4"/>
+              <w:left w:val="single" w:color="BFC3C9" w:sz="4"/>
+              <w:bottom w:val="single" w:color="BFC3C9" w:sz="4"/>
+              <w:right w:val="single" w:color="BFC3C9" w:sz="4"/>
+            </w:tcBorders>
+            <w:tcMar>
+              <w:top w:type="dxa" w:w="60"/>
+              <w:left w:type="dxa" w:w="90"/>
+              <w:bottom w:type="dxa" w:w="60"/>
+              <w:right w:type="dxa" w:w="90"/>
+            </w:tcMar>
+          </w:tcPr>
+          <w:p>
+            <w:r>
+              <w:rPr>
+                <w:b w:val="false"/>
+                <w:bCs w:val="false"/>
+                <w:sz w:val="20"/>
+                <w:szCs w:val="20"/>
+              </w:rPr>
+              <w:t xml:space="preserve">Described as needing high volumes. An older post gives a 10-box minimum per design at Pedal Parts Plus</w:t>
+            </w:r>
+          </w:p>
+        </w:tc>
+        <w:tc>
+          <w:tcPr>
+            <w:tcW w:type="dxa" w:w="2600"/>
+            <w:tcBorders>
+              <w:top w:val="single" w:color="BFC3C9" w:sz="4"/>
+              <w:left w:val="single" w:color="BFC3C9" w:sz="4"/>
+              <w:bottom w:val="single" w:color="BFC3C9" w:sz="4"/>
+              <w:right w:val="single" w:color="BFC3C9" w:sz="4"/>
+            </w:tcBorders>
+            <w:tcMar>
+              <w:top w:type="dxa" w:w="60"/>
+              <w:left w:type="dxa" w:w="90"/>
+              <w:bottom w:type="dxa" w:w="60"/>
+              <w:right w:type="dxa" w:w="90"/>
+            </w:tcMar>
+          </w:tcPr>
+          <w:p>
+            <w:r>
+              <w:rPr>
+                <w:b w:val="false"/>
+                <w:bCs w:val="false"/>
+                <w:sz w:val="20"/>
+                <w:szCs w:val="20"/>
+              </w:rPr>
+              <w:t xml:space="preserve">Described as not wearing off. Hard to do yourself, and awkward for many colours</w:t>
+            </w:r>
+          </w:p>
+        </w:tc>
+      </w:tr>
+      <w:tr>
+        <w:trPr>
+          <w:cantSplit/>
+        </w:trPr>
+        <w:tc>
+          <w:tcPr>
+            <w:tcW w:type="dxa" w:w="1600"/>
+            <w:tcBorders>
+              <w:top w:val="single" w:color="BFC3C9" w:sz="4"/>
+              <w:left w:val="single" w:color="BFC3C9" w:sz="4"/>
+              <w:bottom w:val="single" w:color="BFC3C9" w:sz="4"/>
+              <w:right w:val="single" w:color="BFC3C9" w:sz="4"/>
+            </w:tcBorders>
+            <w:tcMar>
+              <w:top w:type="dxa" w:w="60"/>
+              <w:left w:type="dxa" w:w="90"/>
+              <w:bottom w:type="dxa" w:w="60"/>
+              <w:right w:type="dxa" w:w="90"/>
+            </w:tcMar>
+          </w:tcPr>
+          <w:p>
+            <w:r>
+              <w:rPr>
+                <w:b w:val="false"/>
+                <w:bCs w:val="false"/>
+                <w:sz w:val="20"/>
+                <w:szCs w:val="20"/>
+              </w:rPr>
+              <w:t xml:space="preserve">Pad printing</w:t>
+            </w:r>
+          </w:p>
+        </w:tc>
+        <w:tc>
+          <w:tcPr>
+            <w:tcW w:type="dxa" w:w="2660"/>
+            <w:tcBorders>
+              <w:top w:val="single" w:color="BFC3C9" w:sz="4"/>
+              <w:left w:val="single" w:color="BFC3C9" w:sz="4"/>
+              <w:bottom w:val="single" w:color="BFC3C9" w:sz="4"/>
+              <w:right w:val="single" w:color="BFC3C9" w:sz="4"/>
+            </w:tcBorders>
+            <w:tcMar>
+              <w:top w:type="dxa" w:w="60"/>
+              <w:left w:type="dxa" w:w="90"/>
+              <w:bottom w:type="dxa" w:w="60"/>
+              <w:right w:type="dxa" w:w="90"/>
+            </w:tcMar>
+          </w:tcPr>
+          <w:p>
+            <w:r>
+              <w:rPr>
+                <w:b w:val="false"/>
+                <w:bCs w:val="false"/>
+                <w:sz w:val="20"/>
+                <w:szCs w:val="20"/>
+              </w:rPr>
+              <w:t xml:space="preserve">A soft silicone pad picks up ink and presses it onto the box</w:t>
+            </w:r>
+          </w:p>
+        </w:tc>
+        <w:tc>
+          <w:tcPr>
+            <w:tcW w:type="dxa" w:w="2500"/>
+            <w:tcBorders>
+              <w:top w:val="single" w:color="BFC3C9" w:sz="4"/>
+              <w:left w:val="single" w:color="BFC3C9" w:sz="4"/>
+              <w:bottom w:val="single" w:color="BFC3C9" w:sz="4"/>
+              <w:right w:val="single" w:color="BFC3C9" w:sz="4"/>
+            </w:tcBorders>
+            <w:tcMar>
+              <w:top w:type="dxa" w:w="60"/>
+              <w:left w:type="dxa" w:w="90"/>
+              <w:bottom w:type="dxa" w:w="60"/>
+              <w:right w:type="dxa" w:w="90"/>
+            </w:tcMar>
+          </w:tcPr>
+          <w:p>
+            <w:r>
+              <w:rPr>
+                <w:b w:val="false"/>
+                <w:bCs w:val="false"/>
+                <w:sz w:val="20"/>
+                <w:szCs w:val="20"/>
+              </w:rPr>
+              <w:t xml:space="preserve">Setup per colour dominates small runs. No pedal-specific price found</w:t>
+            </w:r>
+          </w:p>
+        </w:tc>
+        <w:tc>
+          <w:tcPr>
+            <w:tcW w:type="dxa" w:w="2600"/>
+            <w:tcBorders>
+              <w:top w:val="single" w:color="BFC3C9" w:sz="4"/>
+              <w:left w:val="single" w:color="BFC3C9" w:sz="4"/>
+              <w:bottom w:val="single" w:color="BFC3C9" w:sz="4"/>
+              <w:right w:val="single" w:color="BFC3C9" w:sz="4"/>
+            </w:tcBorders>
+            <w:tcMar>
+              <w:top w:type="dxa" w:w="60"/>
+              <w:left w:type="dxa" w:w="90"/>
+              <w:bottom w:type="dxa" w:w="60"/>
+              <w:right w:type="dxa" w:w="90"/>
+            </w:tcMar>
+          </w:tcPr>
+          <w:p>
+            <w:r>
+              <w:rPr>
+                <w:b w:val="false"/>
+                <w:bCs w:val="false"/>
+                <w:sz w:val="20"/>
+                <w:szCs w:val="20"/>
+              </w:rPr>
+              <w:t xml:space="preserve">Common on metal housings. May print unevenly on uneven surfaces</w:t>
+            </w:r>
+          </w:p>
+        </w:tc>
+      </w:tr>
+      <w:tr>
+        <w:trPr>
+          <w:cantSplit/>
+        </w:trPr>
+        <w:tc>
+          <w:tcPr>
+            <w:tcW w:type="dxa" w:w="1600"/>
+            <w:tcBorders>
+              <w:top w:val="single" w:color="BFC3C9" w:sz="4"/>
+              <w:left w:val="single" w:color="BFC3C9" w:sz="4"/>
+              <w:bottom w:val="single" w:color="BFC3C9" w:sz="4"/>
+              <w:right w:val="single" w:color="BFC3C9" w:sz="4"/>
+            </w:tcBorders>
+            <w:tcMar>
+              <w:top w:type="dxa" w:w="60"/>
+              <w:left w:type="dxa" w:w="90"/>
+              <w:bottom w:type="dxa" w:w="60"/>
+              <w:right w:type="dxa" w:w="90"/>
+            </w:tcMar>
+          </w:tcPr>
+          <w:p>
+            <w:r>
+              <w:rPr>
+                <w:b w:val="false"/>
+                <w:bCs w:val="false"/>
+                <w:sz w:val="20"/>
+                <w:szCs w:val="20"/>
+              </w:rPr>
+              <w:t xml:space="preserve">Laser engraving</w:t>
+            </w:r>
+          </w:p>
+        </w:tc>
+        <w:tc>
+          <w:tcPr>
+            <w:tcW w:type="dxa" w:w="2660"/>
+            <w:tcBorders>
+              <w:top w:val="single" w:color="BFC3C9" w:sz="4"/>
+              <w:left w:val="single" w:color="BFC3C9" w:sz="4"/>
+              <w:bottom w:val="single" w:color="BFC3C9" w:sz="4"/>
+              <w:right w:val="single" w:color="BFC3C9" w:sz="4"/>
+            </w:tcBorders>
+            <w:tcMar>
+              <w:top w:type="dxa" w:w="60"/>
+              <w:left w:type="dxa" w:w="90"/>
+              <w:bottom w:type="dxa" w:w="60"/>
+              <w:right w:type="dxa" w:w="90"/>
+            </w:tcMar>
+          </w:tcPr>
+          <w:p>
+            <w:r>
+              <w:rPr>
+                <w:b w:val="false"/>
+                <w:bCs w:val="false"/>
+                <w:sz w:val="20"/>
+                <w:szCs w:val="20"/>
+              </w:rPr>
+              <w:t xml:space="preserve">A laser removes the coating to reveal the layer underneath</w:t>
+            </w:r>
+          </w:p>
+        </w:tc>
+        <w:tc>
+          <w:tcPr>
+            <w:tcW w:type="dxa" w:w="2500"/>
+            <w:tcBorders>
+              <w:top w:val="single" w:color="BFC3C9" w:sz="4"/>
+              <w:left w:val="single" w:color="BFC3C9" w:sz="4"/>
+              <w:bottom w:val="single" w:color="BFC3C9" w:sz="4"/>
+              <w:right w:val="single" w:color="BFC3C9" w:sz="4"/>
+            </w:tcBorders>
+            <w:tcMar>
+              <w:top w:type="dxa" w:w="60"/>
+              <w:left w:type="dxa" w:w="90"/>
+              <w:bottom w:type="dxa" w:w="60"/>
+              <w:right w:type="dxa" w:w="90"/>
+            </w:tcMar>
+          </w:tcPr>
+          <w:p>
+            <w:r>
+              <w:rPr>
+                <w:b w:val="false"/>
+                <w:bCs w:val="false"/>
+                <w:sz w:val="20"/>
+                <w:szCs w:val="20"/>
+              </w:rPr>
+              <w:t xml:space="preserve">Around 3 minutes a box on one builder's machine. Needs your own laser or a supplier that accepts small runs</w:t>
+            </w:r>
+          </w:p>
+        </w:tc>
+        <w:tc>
+          <w:tcPr>
+            <w:tcW w:type="dxa" w:w="2600"/>
+            <w:tcBorders>
+              <w:top w:val="single" w:color="BFC3C9" w:sz="4"/>
+              <w:left w:val="single" w:color="BFC3C9" w:sz="4"/>
+              <w:bottom w:val="single" w:color="BFC3C9" w:sz="4"/>
+              <w:right w:val="single" w:color="BFC3C9" w:sz="4"/>
+            </w:tcBorders>
+            <w:tcMar>
+              <w:top w:type="dxa" w:w="60"/>
+              <w:left w:type="dxa" w:w="90"/>
+              <w:bottom w:type="dxa" w:w="60"/>
+              <w:right w:type="dxa" w:w="90"/>
+            </w:tcMar>
+          </w:tcPr>
+          <w:p>
+            <w:r>
+              <w:rPr>
+                <w:b w:val="false"/>
+                <w:bCs w:val="false"/>
+                <w:sz w:val="20"/>
+                <w:szCs w:val="20"/>
+              </w:rPr>
+              <w:t xml:space="preserve">Very sharp and durable, but effectively one colour. Contrast depends on the coating, and wrong settings can discolour it, so test first</w:t>
+            </w:r>
+          </w:p>
+        </w:tc>
+      </w:tr>
+      <w:tr>
+        <w:trPr>
+          <w:cantSplit/>
+        </w:trPr>
+        <w:tc>
+          <w:tcPr>
+            <w:tcW w:type="dxa" w:w="1600"/>
+            <w:tcBorders>
+              <w:top w:val="single" w:color="BFC3C9" w:sz="4"/>
+              <w:left w:val="single" w:color="BFC3C9" w:sz="4"/>
+              <w:bottom w:val="single" w:color="BFC3C9" w:sz="4"/>
+              <w:right w:val="single" w:color="BFC3C9" w:sz="4"/>
+            </w:tcBorders>
+            <w:tcMar>
+              <w:top w:type="dxa" w:w="60"/>
+              <w:left w:type="dxa" w:w="90"/>
+              <w:bottom w:type="dxa" w:w="60"/>
+              <w:right w:type="dxa" w:w="90"/>
+            </w:tcMar>
+          </w:tcPr>
+          <w:p>
+            <w:r>
+              <w:rPr>
+                <w:b/>
+                <w:bCs/>
+                <w:sz w:val="20"/>
+                <w:szCs w:val="20"/>
+              </w:rPr>
+              <w:t xml:space="preserve">Waterslide decal</w:t>
+            </w:r>
+          </w:p>
+        </w:tc>
+        <w:tc>
+          <w:tcPr>
+            <w:tcW w:type="dxa" w:w="2660"/>
+            <w:tcBorders>
+              <w:top w:val="single" w:color="BFC3C9" w:sz="4"/>
+              <w:left w:val="single" w:color="BFC3C9" w:sz="4"/>
+              <w:bottom w:val="single" w:color="BFC3C9" w:sz="4"/>
+              <w:right w:val="single" w:color="BFC3C9" w:sz="4"/>
+            </w:tcBorders>
+            <w:tcMar>
+              <w:top w:type="dxa" w:w="60"/>
+              <w:left w:type="dxa" w:w="90"/>
+              <w:bottom w:type="dxa" w:w="60"/>
+              <w:right w:type="dxa" w:w="90"/>
+            </w:tcMar>
+          </w:tcPr>
+          <w:p>
+            <w:r>
+              <w:rPr>
+                <w:b w:val="false"/>
+                <w:bCs w:val="false"/>
+                <w:sz w:val="20"/>
+                <w:szCs w:val="20"/>
+              </w:rPr>
+              <w:t xml:space="preserve">Print on decal paper, slide it onto the box, then seal it with clear coat</w:t>
+            </w:r>
+          </w:p>
+        </w:tc>
+        <w:tc>
+          <w:tcPr>
+            <w:tcW w:type="dxa" w:w="2500"/>
+            <w:tcBorders>
+              <w:top w:val="single" w:color="BFC3C9" w:sz="4"/>
+              <w:left w:val="single" w:color="BFC3C9" w:sz="4"/>
+              <w:bottom w:val="single" w:color="BFC3C9" w:sz="4"/>
+              <w:right w:val="single" w:color="BFC3C9" w:sz="4"/>
+            </w:tcBorders>
+            <w:tcMar>
+              <w:top w:type="dxa" w:w="60"/>
+              <w:left w:type="dxa" w:w="90"/>
+              <w:bottom w:type="dxa" w:w="60"/>
+              <w:right w:type="dxa" w:w="90"/>
+            </w:tcMar>
+          </w:tcPr>
+          <w:p>
+            <w:r>
+              <w:rPr>
+                <w:b w:val="false"/>
+                <w:bCs w:val="false"/>
+                <w:sz w:val="20"/>
+                <w:szCs w:val="20"/>
+              </w:rPr>
+              <w:t xml:space="preserve">Cheap, with no minimum</w:t>
+            </w:r>
+          </w:p>
+        </w:tc>
+        <w:tc>
+          <w:tcPr>
+            <w:tcW w:type="dxa" w:w="2600"/>
+            <w:tcBorders>
+              <w:top w:val="single" w:color="BFC3C9" w:sz="4"/>
+              <w:left w:val="single" w:color="BFC3C9" w:sz="4"/>
+              <w:bottom w:val="single" w:color="BFC3C9" w:sz="4"/>
+              <w:right w:val="single" w:color="BFC3C9" w:sz="4"/>
+            </w:tcBorders>
+            <w:tcMar>
+              <w:top w:type="dxa" w:w="60"/>
+              <w:left w:type="dxa" w:w="90"/>
+              <w:bottom w:type="dxa" w:w="60"/>
+              <w:right w:type="dxa" w:w="90"/>
+            </w:tcMar>
+          </w:tcPr>
+          <w:p>
+            <w:r>
+              <w:rPr>
+                <w:b w:val="false"/>
+                <w:bCs w:val="false"/>
+                <w:sz w:val="20"/>
+                <w:szCs w:val="20"/>
+              </w:rPr>
+              <w:t xml:space="preserve">Good for prototypes. Slow, results vary, and clear coat is the hard part. Can show </w:t>
+            </w:r>
+            <w:r>
+              <w:rPr>
+                <w:b/>
+                <w:bCs/>
+                <w:sz w:val="20"/>
+                <w:szCs w:val="20"/>
+              </w:rPr>
+              <w:t xml:space="preserve">silvering</w:t>
+            </w:r>
+            <w:r>
+              <w:rPr>
+                <w:b w:val="false"/>
+                <w:bCs w:val="false"/>
+                <w:sz w:val="20"/>
+                <w:szCs w:val="20"/>
+              </w:rPr>
+              <w:t xml:space="preserve"> on a surface that isn't glossy enough</w:t>
+            </w:r>
+          </w:p>
+        </w:tc>
+      </w:tr>
+      <w:tr>
+        <w:trPr>
+          <w:cantSplit/>
+        </w:trPr>
+        <w:tc>
+          <w:tcPr>
+            <w:tcW w:type="dxa" w:w="1600"/>
+            <w:tcBorders>
+              <w:top w:val="single" w:color="BFC3C9" w:sz="4"/>
+              <w:left w:val="single" w:color="BFC3C9" w:sz="4"/>
+              <w:bottom w:val="single" w:color="BFC3C9" w:sz="4"/>
+              <w:right w:val="single" w:color="BFC3C9" w:sz="4"/>
+            </w:tcBorders>
+            <w:tcMar>
+              <w:top w:type="dxa" w:w="60"/>
+              <w:left w:type="dxa" w:w="90"/>
+              <w:bottom w:type="dxa" w:w="60"/>
+              <w:right w:type="dxa" w:w="90"/>
+            </w:tcMar>
+          </w:tcPr>
+          <w:p>
+            <w:r>
+              <w:rPr>
+                <w:b/>
+                <w:bCs/>
+                <w:sz w:val="20"/>
+                <w:szCs w:val="20"/>
+              </w:rPr>
+              <w:t xml:space="preserve">UV DTF</w:t>
+            </w:r>
+            <w:r>
+              <w:rPr>
+                <w:b w:val="false"/>
+                <w:bCs w:val="false"/>
+                <w:sz w:val="20"/>
+                <w:szCs w:val="20"/>
+              </w:rPr>
+              <w:t xml:space="preserve"> transfer</w:t>
+            </w:r>
+          </w:p>
+        </w:tc>
+        <w:tc>
+          <w:tcPr>
+            <w:tcW w:type="dxa" w:w="2660"/>
+            <w:tcBorders>
+              <w:top w:val="single" w:color="BFC3C9" w:sz="4"/>
+              <w:left w:val="single" w:color="BFC3C9" w:sz="4"/>
+              <w:bottom w:val="single" w:color="BFC3C9" w:sz="4"/>
+              <w:right w:val="single" w:color="BFC3C9" w:sz="4"/>
+            </w:tcBorders>
+            <w:tcMar>
+              <w:top w:type="dxa" w:w="60"/>
+              <w:left w:type="dxa" w:w="90"/>
+              <w:bottom w:type="dxa" w:w="60"/>
+              <w:right w:type="dxa" w:w="90"/>
+            </w:tcMar>
+          </w:tcPr>
+          <w:p>
+            <w:r>
+              <w:rPr>
+                <w:b w:val="false"/>
+                <w:bCs w:val="false"/>
+                <w:sz w:val="20"/>
+                <w:szCs w:val="20"/>
+              </w:rPr>
+              <w:t xml:space="preserve">A printed transfer sticker is pressed on, with no machine needed</w:t>
+            </w:r>
+          </w:p>
+        </w:tc>
+        <w:tc>
+          <w:tcPr>
+            <w:tcW w:type="dxa" w:w="2500"/>
+            <w:tcBorders>
+              <w:top w:val="single" w:color="BFC3C9" w:sz="4"/>
+              <w:left w:val="single" w:color="BFC3C9" w:sz="4"/>
+              <w:bottom w:val="single" w:color="BFC3C9" w:sz="4"/>
+              <w:right w:val="single" w:color="BFC3C9" w:sz="4"/>
+            </w:tcBorders>
+            <w:tcMar>
+              <w:top w:type="dxa" w:w="60"/>
+              <w:left w:type="dxa" w:w="90"/>
+              <w:bottom w:type="dxa" w:w="60"/>
+              <w:right w:type="dxa" w:w="90"/>
+            </w:tcMar>
+          </w:tcPr>
+          <w:p>
+            <w:r>
+              <w:rPr>
+                <w:b w:val="false"/>
+                <w:bCs w:val="false"/>
+                <w:sz w:val="20"/>
+                <w:szCs w:val="20"/>
+              </w:rPr>
+              <w:t xml:space="preserve">Sold by the sheet, with low minimums</w:t>
+            </w:r>
+          </w:p>
+        </w:tc>
+        <w:tc>
+          <w:tcPr>
+            <w:tcW w:type="dxa" w:w="2600"/>
+            <w:tcBorders>
+              <w:top w:val="single" w:color="BFC3C9" w:sz="4"/>
+              <w:left w:val="single" w:color="BFC3C9" w:sz="4"/>
+              <w:bottom w:val="single" w:color="BFC3C9" w:sz="4"/>
+              <w:right w:val="single" w:color="BFC3C9" w:sz="4"/>
+            </w:tcBorders>
+            <w:tcMar>
+              <w:top w:type="dxa" w:w="60"/>
+              <w:left w:type="dxa" w:w="90"/>
+              <w:bottom w:type="dxa" w:w="60"/>
+              <w:right w:type="dxa" w:w="90"/>
+            </w:tcMar>
+          </w:tcPr>
+          <w:p>
+            <w:r>
+              <w:rPr>
+                <w:b w:val="false"/>
+                <w:bCs w:val="false"/>
+                <w:sz w:val="20"/>
+                <w:szCs w:val="20"/>
+              </w:rPr>
+              <w:t xml:space="preserve">One seller estimates 1–3 years on metal handled daily, with edge wear the main risk. No independent test data found</w:t>
+            </w:r>
+          </w:p>
+        </w:tc>
+      </w:tr>
+      <w:tr>
+        <w:trPr>
+          <w:cantSplit/>
+        </w:trPr>
+        <w:tc>
+          <w:tcPr>
+            <w:tcW w:type="dxa" w:w="1600"/>
+            <w:tcBorders>
+              <w:top w:val="single" w:color="BFC3C9" w:sz="4"/>
+              <w:left w:val="single" w:color="BFC3C9" w:sz="4"/>
+              <w:bottom w:val="single" w:color="BFC3C9" w:sz="4"/>
+              <w:right w:val="single" w:color="BFC3C9" w:sz="4"/>
+            </w:tcBorders>
+            <w:tcMar>
+              <w:top w:type="dxa" w:w="60"/>
+              <w:left w:type="dxa" w:w="90"/>
+              <w:bottom w:type="dxa" w:w="60"/>
+              <w:right w:type="dxa" w:w="90"/>
+            </w:tcMar>
+          </w:tcPr>
+          <w:p>
+            <w:r>
+              <w:rPr>
+                <w:b/>
+                <w:bCs/>
+                <w:sz w:val="20"/>
+                <w:szCs w:val="20"/>
+              </w:rPr>
+              <w:t xml:space="preserve">Graphic overlay</w:t>
+            </w:r>
+          </w:p>
+        </w:tc>
+        <w:tc>
+          <w:tcPr>
+            <w:tcW w:type="dxa" w:w="2660"/>
+            <w:tcBorders>
+              <w:top w:val="single" w:color="BFC3C9" w:sz="4"/>
+              <w:left w:val="single" w:color="BFC3C9" w:sz="4"/>
+              <w:bottom w:val="single" w:color="BFC3C9" w:sz="4"/>
+              <w:right w:val="single" w:color="BFC3C9" w:sz="4"/>
+            </w:tcBorders>
+            <w:tcMar>
+              <w:top w:type="dxa" w:w="60"/>
+              <w:left w:type="dxa" w:w="90"/>
+              <w:bottom w:type="dxa" w:w="60"/>
+              <w:right w:type="dxa" w:w="90"/>
+            </w:tcMar>
+          </w:tcPr>
+          <w:p>
+            <w:r>
+              <w:rPr>
+                <w:b w:val="false"/>
+                <w:bCs w:val="false"/>
+                <w:sz w:val="20"/>
+                <w:szCs w:val="20"/>
+              </w:rPr>
+              <w:t xml:space="preserve">A printed plastic sheet with adhesive backing covers the panel, with clear windows for LEDs</w:t>
+            </w:r>
+          </w:p>
+        </w:tc>
+        <w:tc>
+          <w:tcPr>
+            <w:tcW w:type="dxa" w:w="2500"/>
+            <w:tcBorders>
+              <w:top w:val="single" w:color="BFC3C9" w:sz="4"/>
+              <w:left w:val="single" w:color="BFC3C9" w:sz="4"/>
+              <w:bottom w:val="single" w:color="BFC3C9" w:sz="4"/>
+              <w:right w:val="single" w:color="BFC3C9" w:sz="4"/>
+            </w:tcBorders>
+            <w:tcMar>
+              <w:top w:type="dxa" w:w="60"/>
+              <w:left w:type="dxa" w:w="90"/>
+              <w:bottom w:type="dxa" w:w="60"/>
+              <w:right w:type="dxa" w:w="90"/>
+            </w:tcMar>
+          </w:tcPr>
+          <w:p>
+            <w:r>
+              <w:rPr>
+                <w:b w:val="false"/>
+                <w:bCs w:val="false"/>
+                <w:sz w:val="20"/>
+                <w:szCs w:val="20"/>
+              </w:rPr>
+              <w:t xml:space="preserve">One supplier lists a $300 minimum order</w:t>
+            </w:r>
+          </w:p>
+        </w:tc>
+        <w:tc>
+          <w:tcPr>
+            <w:tcW w:type="dxa" w:w="2600"/>
+            <w:tcBorders>
+              <w:top w:val="single" w:color="BFC3C9" w:sz="4"/>
+              <w:left w:val="single" w:color="BFC3C9" w:sz="4"/>
+              <w:bottom w:val="single" w:color="BFC3C9" w:sz="4"/>
+              <w:right w:val="single" w:color="BFC3C9" w:sz="4"/>
+            </w:tcBorders>
+            <w:tcMar>
+              <w:top w:type="dxa" w:w="60"/>
+              <w:left w:type="dxa" w:w="90"/>
+              <w:bottom w:type="dxa" w:w="60"/>
+              <w:right w:type="dxa" w:w="90"/>
+            </w:tcMar>
+          </w:tcPr>
+          <w:p>
+            <w:r>
+              <w:rPr>
+                <w:b w:val="false"/>
+                <w:bCs w:val="false"/>
+                <w:sz w:val="20"/>
+                <w:szCs w:val="20"/>
+              </w:rPr>
+              <w:t xml:space="preserve">A different feel from a printed box, and adhesion has to be tested on the actual surface</w:t>
+            </w:r>
+          </w:p>
+        </w:tc>
+      </w:tr>
+      <w:tr>
+        <w:trPr>
+          <w:cantSplit/>
+        </w:trPr>
+        <w:tc>
+          <w:tcPr>
+            <w:tcW w:type="dxa" w:w="1600"/>
+            <w:tcBorders>
+              <w:top w:val="single" w:color="BFC3C9" w:sz="4"/>
+              <w:left w:val="single" w:color="BFC3C9" w:sz="4"/>
+              <w:bottom w:val="single" w:color="BFC3C9" w:sz="4"/>
+              <w:right w:val="single" w:color="BFC3C9" w:sz="4"/>
+            </w:tcBorders>
+            <w:tcMar>
+              <w:top w:type="dxa" w:w="60"/>
+              <w:left w:type="dxa" w:w="90"/>
+              <w:bottom w:type="dxa" w:w="60"/>
+              <w:right w:type="dxa" w:w="90"/>
+            </w:tcMar>
+          </w:tcPr>
+          <w:p>
+            <w:r>
+              <w:rPr>
+                <w:b w:val="false"/>
+                <w:bCs w:val="false"/>
+                <w:sz w:val="20"/>
+                <w:szCs w:val="20"/>
+              </w:rPr>
+              <w:t xml:space="preserve">Laser-etched or printed faceplate</w:t>
+            </w:r>
+          </w:p>
+        </w:tc>
+        <w:tc>
+          <w:tcPr>
+            <w:tcW w:type="dxa" w:w="2660"/>
+            <w:tcBorders>
+              <w:top w:val="single" w:color="BFC3C9" w:sz="4"/>
+              <w:left w:val="single" w:color="BFC3C9" w:sz="4"/>
+              <w:bottom w:val="single" w:color="BFC3C9" w:sz="4"/>
+              <w:right w:val="single" w:color="BFC3C9" w:sz="4"/>
+            </w:tcBorders>
+            <w:tcMar>
+              <w:top w:type="dxa" w:w="60"/>
+              <w:left w:type="dxa" w:w="90"/>
+              <w:bottom w:type="dxa" w:w="60"/>
+              <w:right w:type="dxa" w:w="90"/>
+            </w:tcMar>
+          </w:tcPr>
+          <w:p>
+            <w:r>
+              <w:rPr>
+                <w:b w:val="false"/>
+                <w:bCs w:val="false"/>
+                <w:sz w:val="20"/>
+                <w:szCs w:val="20"/>
+              </w:rPr>
+              <w:t xml:space="preserve">A separate plate carries the art and is fixed to the box</w:t>
+            </w:r>
+          </w:p>
+        </w:tc>
+        <w:tc>
+          <w:tcPr>
+            <w:tcW w:type="dxa" w:w="2500"/>
+            <w:tcBorders>
+              <w:top w:val="single" w:color="BFC3C9" w:sz="4"/>
+              <w:left w:val="single" w:color="BFC3C9" w:sz="4"/>
+              <w:bottom w:val="single" w:color="BFC3C9" w:sz="4"/>
+              <w:right w:val="single" w:color="BFC3C9" w:sz="4"/>
+            </w:tcBorders>
+            <w:tcMar>
+              <w:top w:type="dxa" w:w="60"/>
+              <w:left w:type="dxa" w:w="90"/>
+              <w:bottom w:type="dxa" w:w="60"/>
+              <w:right w:type="dxa" w:w="90"/>
+            </w:tcMar>
+          </w:tcPr>
+          <w:p>
+            <w:r>
+              <w:rPr>
+                <w:b w:val="false"/>
+                <w:bCs w:val="false"/>
+                <w:sz w:val="20"/>
+                <w:szCs w:val="20"/>
+              </w:rPr>
+              <w:t xml:space="preserve">Described as expensive, and hard to source in small runs</w:t>
+            </w:r>
+          </w:p>
+        </w:tc>
+        <w:tc>
+          <w:tcPr>
+            <w:tcW w:type="dxa" w:w="2600"/>
+            <w:tcBorders>
+              <w:top w:val="single" w:color="BFC3C9" w:sz="4"/>
+              <w:left w:val="single" w:color="BFC3C9" w:sz="4"/>
+              <w:bottom w:val="single" w:color="BFC3C9" w:sz="4"/>
+              <w:right w:val="single" w:color="BFC3C9" w:sz="4"/>
+            </w:tcBorders>
+            <w:tcMar>
+              <w:top w:type="dxa" w:w="60"/>
+              <w:left w:type="dxa" w:w="90"/>
+              <w:bottom w:type="dxa" w:w="60"/>
+              <w:right w:type="dxa" w:w="90"/>
+            </w:tcMar>
+          </w:tcPr>
+          <w:p>
+            <w:r>
+              <w:rPr>
+                <w:b w:val="false"/>
+                <w:bCs w:val="false"/>
+                <w:sz w:val="20"/>
+                <w:szCs w:val="20"/>
+              </w:rPr>
+              <w:t xml:space="preserve">Looks professional, and suppliers like Amplify Fun list faceplates</w:t>
+            </w:r>
+          </w:p>
+        </w:tc>
+      </w:tr>
+      <w:tr>
+        <w:trPr>
+          <w:cantSplit/>
+        </w:trPr>
+        <w:tc>
+          <w:tcPr>
+            <w:tcW w:type="dxa" w:w="1600"/>
+            <w:tcBorders>
+              <w:top w:val="single" w:color="BFC3C9" w:sz="4"/>
+              <w:left w:val="single" w:color="BFC3C9" w:sz="4"/>
+              <w:bottom w:val="single" w:color="BFC3C9" w:sz="4"/>
+              <w:right w:val="single" w:color="BFC3C9" w:sz="4"/>
+            </w:tcBorders>
+            <w:tcMar>
+              <w:top w:type="dxa" w:w="60"/>
+              <w:left w:type="dxa" w:w="90"/>
+              <w:bottom w:type="dxa" w:w="60"/>
+              <w:right w:type="dxa" w:w="90"/>
+            </w:tcMar>
+          </w:tcPr>
+          <w:p>
+            <w:r>
+              <w:rPr>
+                <w:b w:val="false"/>
+                <w:bCs w:val="false"/>
+                <w:sz w:val="20"/>
+                <w:szCs w:val="20"/>
+              </w:rPr>
+              <w:t xml:space="preserve">Acid etching</w:t>
+            </w:r>
+          </w:p>
+        </w:tc>
+        <w:tc>
+          <w:tcPr>
+            <w:tcW w:type="dxa" w:w="2660"/>
+            <w:tcBorders>
+              <w:top w:val="single" w:color="BFC3C9" w:sz="4"/>
+              <w:left w:val="single" w:color="BFC3C9" w:sz="4"/>
+              <w:bottom w:val="single" w:color="BFC3C9" w:sz="4"/>
+              <w:right w:val="single" w:color="BFC3C9" w:sz="4"/>
+            </w:tcBorders>
+            <w:tcMar>
+              <w:top w:type="dxa" w:w="60"/>
+              <w:left w:type="dxa" w:w="90"/>
+              <w:bottom w:type="dxa" w:w="60"/>
+              <w:right w:type="dxa" w:w="90"/>
+            </w:tcMar>
+          </w:tcPr>
+          <w:p>
+            <w:r>
+              <w:rPr>
+                <w:b w:val="false"/>
+                <w:bCs w:val="false"/>
+                <w:sz w:val="20"/>
+                <w:szCs w:val="20"/>
+              </w:rPr>
+              <w:t xml:space="preserve">Acid cuts the design into bare aluminium</w:t>
+            </w:r>
+          </w:p>
+        </w:tc>
+        <w:tc>
+          <w:tcPr>
+            <w:tcW w:type="dxa" w:w="2500"/>
+            <w:tcBorders>
+              <w:top w:val="single" w:color="BFC3C9" w:sz="4"/>
+              <w:left w:val="single" w:color="BFC3C9" w:sz="4"/>
+              <w:bottom w:val="single" w:color="BFC3C9" w:sz="4"/>
+              <w:right w:val="single" w:color="BFC3C9" w:sz="4"/>
+            </w:tcBorders>
+            <w:tcMar>
+              <w:top w:type="dxa" w:w="60"/>
+              <w:left w:type="dxa" w:w="90"/>
+              <w:bottom w:type="dxa" w:w="60"/>
+              <w:right w:type="dxa" w:w="90"/>
+            </w:tcMar>
+          </w:tcPr>
+          <w:p>
+            <w:r>
+              <w:rPr>
+                <w:b w:val="false"/>
+                <w:bCs w:val="false"/>
+                <w:sz w:val="20"/>
+                <w:szCs w:val="20"/>
+              </w:rPr>
+              <w:t xml:space="preserve">Cheap, with no minimum</w:t>
+            </w:r>
+          </w:p>
+        </w:tc>
+        <w:tc>
+          <w:tcPr>
+            <w:tcW w:type="dxa" w:w="2600"/>
+            <w:tcBorders>
+              <w:top w:val="single" w:color="BFC3C9" w:sz="4"/>
+              <w:left w:val="single" w:color="BFC3C9" w:sz="4"/>
+              <w:bottom w:val="single" w:color="BFC3C9" w:sz="4"/>
+              <w:right w:val="single" w:color="BFC3C9" w:sz="4"/>
+            </w:tcBorders>
+            <w:tcMar>
+              <w:top w:type="dxa" w:w="60"/>
+              <w:left w:type="dxa" w:w="90"/>
+              <w:bottom w:type="dxa" w:w="60"/>
+              <w:right w:type="dxa" w:w="90"/>
+            </w:tcMar>
+          </w:tcPr>
+          <w:p>
+            <w:r>
+              <w:rPr>
+                <w:b w:val="false"/>
+                <w:bCs w:val="false"/>
+                <w:sz w:val="20"/>
+                <w:szCs w:val="20"/>
+              </w:rPr>
+              <w:t xml:space="preserve">Hard to get neat, slow, and an acid hazard. Not suited to a product</w:t>
+            </w:r>
+          </w:p>
+        </w:tc>
+      </w:tr>
+    </w:tbl>
+    <w:p>
+      <w:pPr>
+        <w:keepNext/>
+        <w:spacing w:after="80" w:before="200"/>
+      </w:pPr>
+      <w:r>
+        <w:rPr>
+          <w:b/>
+          <w:bCs/>
+        </w:rPr>
+        <w:t xml:space="preserve">What this means for Flashover</w:t>
       </w:r>
     </w:p>
     <w:p>
@@ -1481,7 +3387,322 @@
         </w:numPr>
         <w:spacing w:after="80"/>
       </w:pPr>
-      <w:hyperlink w:history="1" r:id="rIde04wwrzfwc6_j5t4yjrlb">
+      <w:r>
+        <w:rPr>
+          <w:b/>
+          <w:bCs/>
+        </w:rPr>
+        <w:t xml:space="preserve">Print area:</w:t>
+      </w:r>
+      <w:r>
+        <w:rPr>
+          <w:b w:val="false"/>
+          <w:bCs w:val="false"/>
+        </w:rPr>
+        <w:t xml:space="preserve"> Tayda's 1590BB template is 90 x 115.5 mm on a 94 x 119.5 mm box, so artwork stops about 2 mm short of each edge. Plan for a plain border or a background colour that comes from the coating.</w:t>
+      </w:r>
+    </w:p>
+    <w:p>
+      <w:pPr>
+        <w:pStyle w:val="ListParagraph"/>
+        <w:numPr>
+          <w:ilvl w:val="0"/>
+          <w:numId w:val="2"/>
+        </w:numPr>
+        <w:spacing w:after="80"/>
+      </w:pPr>
+      <w:r>
+        <w:rPr>
+          <w:b/>
+          <w:bCs/>
+        </w:rPr>
+        <w:t xml:space="preserve">Lining up art and holes:</w:t>
+      </w:r>
+      <w:r>
+        <w:rPr>
+          <w:b w:val="false"/>
+          <w:bCs w:val="false"/>
+        </w:rPr>
+        <w:t xml:space="preserve"> no official alignment figure turned up, and the drill tolerance alone is ±0.5 mm. Forum users also report that Tayda's drill and print templates use different reference points. Avoid thin printed circles close around the knobs or the 33 ring LEDs, where a small shift would show.</w:t>
+      </w:r>
+    </w:p>
+    <w:p>
+      <w:pPr>
+        <w:pStyle w:val="ListParagraph"/>
+        <w:numPr>
+          <w:ilvl w:val="0"/>
+          <w:numId w:val="2"/>
+        </w:numPr>
+        <w:spacing w:after="80"/>
+      </w:pPr>
+      <w:r>
+        <w:rPr>
+          <w:b/>
+          <w:bCs/>
+        </w:rPr>
+        <w:t xml:space="preserve">Copper:</w:t>
+      </w:r>
+      <w:r>
+        <w:rPr>
+          <w:b w:val="false"/>
+          <w:bCs w:val="false"/>
+        </w:rPr>
+        <w:t xml:space="preserve"> the Greywire site uses a dark and copper theme, but Tayda can't print gold or silver, so a true metallic copper print isn't an option there. A copper-coloured box with dark printing would come closer, and Tayda has listed candy copper boxes in other sizes.</w:t>
+      </w:r>
+    </w:p>
+    <w:p>
+      <w:pPr>
+        <w:pStyle w:val="ListParagraph"/>
+        <w:numPr>
+          <w:ilvl w:val="0"/>
+          <w:numId w:val="2"/>
+        </w:numPr>
+        <w:spacing w:after="80"/>
+      </w:pPr>
+      <w:r>
+        <w:rPr>
+          <w:b/>
+          <w:bCs/>
+        </w:rPr>
+        <w:t xml:space="preserve">Jack labels:</w:t>
+      </w:r>
+      <w:r>
+        <w:rPr>
+          <w:b w:val="false"/>
+          <w:bCs w:val="false"/>
+        </w:rPr>
+        <w:t xml:space="preserve"> the jacks are on the walls, and it isn't confirmed that wall printing is offered. If it isn't, the labels can go on the top panel next to each wall.</w:t>
+      </w:r>
+    </w:p>
+    <w:p>
+      <w:pPr>
+        <w:pStyle w:val="ListParagraph"/>
+        <w:numPr>
+          <w:ilvl w:val="0"/>
+          <w:numId w:val="2"/>
+        </w:numPr>
+        <w:spacing w:after="80"/>
+      </w:pPr>
+      <w:r>
+        <w:rPr>
+          <w:b/>
+          <w:bCs/>
+        </w:rPr>
+        <w:t xml:space="preserve">Artwork files:</w:t>
+      </w:r>
+      <w:r>
+        <w:rPr>
+          <w:b w:val="false"/>
+          <w:bCs w:val="false"/>
+        </w:rPr>
+        <w:t xml:space="preserve"> Tayda asks for </w:t>
+      </w:r>
+      <w:r>
+        <w:rPr>
+          <w:b/>
+          <w:bCs/>
+        </w:rPr>
+        <w:t xml:space="preserve">vector artwork</w:t>
+      </w:r>
+      <w:r>
+        <w:rPr>
+          <w:b w:val="false"/>
+          <w:bCs w:val="false"/>
+        </w:rPr>
+        <w:t xml:space="preserve"> in </w:t>
+      </w:r>
+      <w:r>
+        <w:rPr>
+          <w:b/>
+          <w:bCs/>
+        </w:rPr>
+        <w:t xml:space="preserve">CMYK</w:t>
+      </w:r>
+      <w:r>
+        <w:rPr>
+          <w:b w:val="false"/>
+          <w:bCs w:val="false"/>
+        </w:rPr>
+        <w:t xml:space="preserve">, and recommends Adobe Illustrator. The hand-drawn SVG logo on the website is a starting point.</w:t>
+      </w:r>
+    </w:p>
+    <w:p>
+      <w:pPr>
+        <w:pStyle w:val="ListParagraph"/>
+        <w:numPr>
+          <w:ilvl w:val="0"/>
+          <w:numId w:val="2"/>
+        </w:numPr>
+        <w:spacing w:after="80"/>
+      </w:pPr>
+      <w:r>
+        <w:rPr>
+          <w:b/>
+          <w:bCs/>
+        </w:rPr>
+        <w:t xml:space="preserve">Grounding:</w:t>
+      </w:r>
+      <w:r>
+        <w:rPr>
+          <w:b w:val="false"/>
+          <w:bCs w:val="false"/>
+        </w:rPr>
+        <w:t xml:space="preserve"> this point comes from Claude's own reasoning, not the research. Coatings insulate, so the box may not connect to ground through the jack nuts, which would weaken its shielding against hum. Check with a multimeter on the first coated box. Tayda lists a </w:t>
+      </w:r>
+      <w:r>
+        <w:rPr>
+          <w:b/>
+          <w:bCs/>
+        </w:rPr>
+        <w:t xml:space="preserve">masking</w:t>
+      </w:r>
+      <w:r>
+        <w:rPr>
+          <w:b w:val="false"/>
+          <w:bCs w:val="false"/>
+        </w:rPr>
+        <w:t xml:space="preserve"> service at about $1.50, which could keep contact areas bare.</w:t>
+      </w:r>
+    </w:p>
+    <w:p>
+      <w:pPr>
+        <w:keepNext/>
+        <w:spacing w:after="80" w:before="200"/>
+      </w:pPr>
+      <w:r>
+        <w:rPr>
+          <w:b/>
+          <w:bCs/>
+        </w:rPr>
+        <w:t xml:space="preserve">Recommendation</w:t>
+      </w:r>
+    </w:p>
+    <w:p>
+      <w:pPr>
+        <w:pStyle w:val="ListParagraph"/>
+        <w:numPr>
+          <w:ilvl w:val="0"/>
+          <w:numId w:val="5"/>
+        </w:numPr>
+        <w:spacing w:after="80"/>
+      </w:pPr>
+      <w:r>
+        <w:rPr>
+          <w:b/>
+          <w:bCs/>
+        </w:rPr>
+        <w:t xml:space="preserve">Test fit:</w:t>
+      </w:r>
+      <w:r>
+        <w:rPr>
+          <w:b w:val="false"/>
+          <w:bCs w:val="false"/>
+        </w:rPr>
+        <w:t xml:space="preserve"> keep the first drilled box bare, as recommended above.</w:t>
+      </w:r>
+    </w:p>
+    <w:p>
+      <w:pPr>
+        <w:pStyle w:val="ListParagraph"/>
+        <w:numPr>
+          <w:ilvl w:val="0"/>
+          <w:numId w:val="5"/>
+        </w:numPr>
+        <w:spacing w:after="80"/>
+      </w:pPr>
+      <w:r>
+        <w:rPr>
+          <w:b/>
+          <w:bCs/>
+        </w:rPr>
+        <w:t xml:space="preserve">First look:</w:t>
+      </w:r>
+      <w:r>
+        <w:rPr>
+          <w:b w:val="false"/>
+          <w:bCs w:val="false"/>
+        </w:rPr>
+        <w:t xml:space="preserve"> use a waterslide decal on a spare box to try layouts cheaply.</w:t>
+      </w:r>
+    </w:p>
+    <w:p>
+      <w:pPr>
+        <w:pStyle w:val="ListParagraph"/>
+        <w:numPr>
+          <w:ilvl w:val="0"/>
+          <w:numId w:val="5"/>
+        </w:numPr>
+        <w:spacing w:after="80"/>
+      </w:pPr>
+      <w:r>
+        <w:rPr>
+          <w:b/>
+          <w:bCs/>
+        </w:rPr>
+        <w:t xml:space="preserve">Sample:</w:t>
+      </w:r>
+      <w:r>
+        <w:rPr>
+          <w:b w:val="false"/>
+          <w:bCs w:val="false"/>
+        </w:rPr>
+        <w:t xml:space="preserve"> order a few pre-coated boxes with custom drilling and UV printing from Tayda, with gloss on at least one. Then test them by scrubbing them, wiping them with solvent and stomping on them.</w:t>
+      </w:r>
+    </w:p>
+    <w:p>
+      <w:pPr>
+        <w:pStyle w:val="ListParagraph"/>
+        <w:numPr>
+          <w:ilvl w:val="0"/>
+          <w:numId w:val="5"/>
+        </w:numPr>
+        <w:spacing w:after="80"/>
+      </w:pPr>
+      <w:r>
+        <w:rPr>
+          <w:b/>
+          <w:bCs/>
+        </w:rPr>
+        <w:t xml:space="preserve">For sale:</w:t>
+      </w:r>
+      <w:r>
+        <w:rPr>
+          <w:b w:val="false"/>
+          <w:bCs w:val="false"/>
+        </w:rPr>
+        <w:t xml:space="preserve"> use the coated, drilled and UV-printed box unless the samples wear badly. Get screen printing or laser engraving quotes once orders reach the suppliers' minimums.</w:t>
+      </w:r>
+    </w:p>
+    <w:p>
+      <w:pPr>
+        <w:spacing w:after="120"/>
+      </w:pPr>
+      <w:r>
+        <w:rPr>
+          <w:b w:val="false"/>
+          <w:bCs w:val="false"/>
+        </w:rPr>
+        <w:t xml:space="preserve">The choice of finish stays open as decision 5.3 in the decisions list.</w:t>
+      </w:r>
+    </w:p>
+    <w:p>
+      <w:pPr>
+        <w:pStyle w:val="Heading1"/>
+      </w:pPr>
+      <w:r>
+        <w:t xml:space="preserve">Sources</w:t>
+      </w:r>
+    </w:p>
+    <w:p>
+      <w:pPr>
+        <w:pStyle w:val="ListParagraph"/>
+        <w:numPr>
+          <w:ilvl w:val="0"/>
+          <w:numId w:val="2"/>
+        </w:numPr>
+        <w:spacing w:after="80"/>
+      </w:pPr>
+      <w:hyperlink w:history="1" r:id="rIdnujd4xpc-smuuih6yyasl">
         <w:r>
           <w:rPr>
             <w:rStyle w:val="Hyperlink"/>
@@ -1499,7 +3720,7 @@
         </w:numPr>
         <w:spacing w:after="80"/>
       </w:pPr>
-      <w:hyperlink w:history="1" r:id="rIdjgelle0cnn9nz2casy46z">
+      <w:hyperlink w:history="1" r:id="rId6roe8jkebggtknpnm3ge6">
         <w:r>
           <w:rPr>
             <w:rStyle w:val="Hyperlink"/>
@@ -1517,7 +3738,7 @@
         </w:numPr>
         <w:spacing w:after="80"/>
       </w:pPr>
-      <w:hyperlink w:history="1" r:id="rId7zkiyvlf89fuqtzapo1x1">
+      <w:hyperlink w:history="1" r:id="rIdhox10losdsvkopvy_3cdc">
         <w:r>
           <w:rPr>
             <w:rStyle w:val="Hyperlink"/>
@@ -1535,7 +3756,7 @@
         </w:numPr>
         <w:spacing w:after="80"/>
       </w:pPr>
-      <w:hyperlink w:history="1" r:id="rIdn8kevsuvoefczzvxdu0fp">
+      <w:hyperlink w:history="1" r:id="rIdisy2uymnnzg71gitinfz-">
         <w:r>
           <w:rPr>
             <w:rStyle w:val="Hyperlink"/>
@@ -1546,6 +3767,240 @@
     </w:p>
     <w:p>
       <w:pPr>
+        <w:pStyle w:val="ListParagraph"/>
+        <w:numPr>
+          <w:ilvl w:val="0"/>
+          <w:numId w:val="2"/>
+        </w:numPr>
+        <w:spacing w:after="80"/>
+      </w:pPr>
+      <w:hyperlink w:history="1" r:id="rId6eogpprkeemaacot5rm6g">
+        <w:r>
+          <w:rPr>
+            <w:rStyle w:val="Hyperlink"/>
+          </w:rPr>
+          <w:t xml:space="preserve">Coda Effects: enclosure art methods</w:t>
+        </w:r>
+      </w:hyperlink>
+    </w:p>
+    <w:p>
+      <w:pPr>
+        <w:pStyle w:val="ListParagraph"/>
+        <w:numPr>
+          <w:ilvl w:val="0"/>
+          <w:numId w:val="2"/>
+        </w:numPr>
+        <w:spacing w:after="80"/>
+      </w:pPr>
+      <w:hyperlink w:history="1" r:id="rIdxrofvu5lueykrwv2kwqpm">
+        <w:r>
+          <w:rPr>
+            <w:rStyle w:val="Hyperlink"/>
+          </w:rPr>
+          <w:t xml:space="preserve">Coda Effects: painting and powder coating</w:t>
+        </w:r>
+      </w:hyperlink>
+    </w:p>
+    <w:p>
+      <w:pPr>
+        <w:pStyle w:val="ListParagraph"/>
+        <w:numPr>
+          <w:ilvl w:val="0"/>
+          <w:numId w:val="2"/>
+        </w:numPr>
+        <w:spacing w:after="80"/>
+      </w:pPr>
+      <w:hyperlink w:history="1" r:id="rIdiy6zjsiyvwljgt8chpxlx">
+        <w:r>
+          <w:rPr>
+            <w:rStyle w:val="Hyperlink"/>
+          </w:rPr>
+          <w:t xml:space="preserve">Tayda enclosure UV printing service</w:t>
+        </w:r>
+      </w:hyperlink>
+    </w:p>
+    <w:p>
+      <w:pPr>
+        <w:pStyle w:val="ListParagraph"/>
+        <w:numPr>
+          <w:ilvl w:val="0"/>
+          <w:numId w:val="2"/>
+        </w:numPr>
+        <w:spacing w:after="80"/>
+      </w:pPr>
+      <w:hyperlink w:history="1" r:id="rId5ozqbat10pvwajxulmpm7">
+        <w:r>
+          <w:rPr>
+            <w:rStyle w:val="Hyperlink"/>
+          </w:rPr>
+          <w:t xml:space="preserve">PedalPCB forum: Tayda UV printing tutorial</w:t>
+        </w:r>
+      </w:hyperlink>
+    </w:p>
+    <w:p>
+      <w:pPr>
+        <w:pStyle w:val="ListParagraph"/>
+        <w:numPr>
+          <w:ilvl w:val="0"/>
+          <w:numId w:val="2"/>
+        </w:numPr>
+        <w:spacing w:after="80"/>
+      </w:pPr>
+      <w:hyperlink w:history="1" r:id="rIdfdgxohvd-pptneqjgcved">
+        <w:r>
+          <w:rPr>
+            <w:rStyle w:val="Hyperlink"/>
+          </w:rPr>
+          <w:t xml:space="preserve">PedalPCB forum: silk screening and finish</w:t>
+        </w:r>
+      </w:hyperlink>
+    </w:p>
+    <w:p>
+      <w:pPr>
+        <w:pStyle w:val="ListParagraph"/>
+        <w:numPr>
+          <w:ilvl w:val="0"/>
+          <w:numId w:val="2"/>
+        </w:numPr>
+        <w:spacing w:after="80"/>
+      </w:pPr>
+      <w:hyperlink w:history="1" r:id="rIdumxgu8vyzd3aazmumdbxr">
+        <w:r>
+          <w:rPr>
+            <w:rStyle w:val="Hyperlink"/>
+          </w:rPr>
+          <w:t xml:space="preserve">PedalPCB forum: waterslide decal tutorial</w:t>
+        </w:r>
+      </w:hyperlink>
+    </w:p>
+    <w:p>
+      <w:pPr>
+        <w:pStyle w:val="ListParagraph"/>
+        <w:numPr>
+          <w:ilvl w:val="0"/>
+          <w:numId w:val="2"/>
+        </w:numPr>
+        <w:spacing w:after="80"/>
+      </w:pPr>
+      <w:hyperlink w:history="1" r:id="rIdoafl5-r_1vwol-vcjat-0">
+        <w:r>
+          <w:rPr>
+            <w:rStyle w:val="Hyperlink"/>
+          </w:rPr>
+          <w:t xml:space="preserve">Mad Bean forum: screen printing minimums</w:t>
+        </w:r>
+      </w:hyperlink>
+    </w:p>
+    <w:p>
+      <w:pPr>
+        <w:pStyle w:val="ListParagraph"/>
+        <w:numPr>
+          <w:ilvl w:val="0"/>
+          <w:numId w:val="2"/>
+        </w:numPr>
+        <w:spacing w:after="80"/>
+      </w:pPr>
+      <w:hyperlink w:history="1" r:id="rId-tb2r7t3wccpjgxtz6r2d">
+        <w:r>
+          <w:rPr>
+            <w:rStyle w:val="Hyperlink"/>
+          </w:rPr>
+          <w:t xml:space="preserve">The Fretboard: a builder on powder coat minimums</w:t>
+        </w:r>
+      </w:hyperlink>
+    </w:p>
+    <w:p>
+      <w:pPr>
+        <w:pStyle w:val="ListParagraph"/>
+        <w:numPr>
+          <w:ilvl w:val="0"/>
+          <w:numId w:val="2"/>
+        </w:numPr>
+        <w:spacing w:after="80"/>
+      </w:pPr>
+      <w:hyperlink w:history="1" r:id="rId-fqwxszy-2ulh4v9_bilj">
+        <w:r>
+          <w:rPr>
+            <w:rStyle w:val="Hyperlink"/>
+          </w:rPr>
+          <w:t xml:space="preserve">Plastics Decorating: estimating pad printing costs</w:t>
+        </w:r>
+      </w:hyperlink>
+    </w:p>
+    <w:p>
+      <w:pPr>
+        <w:pStyle w:val="ListParagraph"/>
+        <w:numPr>
+          <w:ilvl w:val="0"/>
+          <w:numId w:val="2"/>
+        </w:numPr>
+        <w:spacing w:after="80"/>
+      </w:pPr>
+      <w:hyperlink w:history="1" r:id="rIdedkq0gp0rx7rdoz_-ecrr">
+        <w:r>
+          <w:rPr>
+            <w:rStyle w:val="Hyperlink"/>
+          </w:rPr>
+          <w:t xml:space="preserve">Atlanta Vinyl Store: UV DTF durability</w:t>
+        </w:r>
+      </w:hyperlink>
+    </w:p>
+    <w:p>
+      <w:pPr>
+        <w:pStyle w:val="ListParagraph"/>
+        <w:numPr>
+          <w:ilvl w:val="0"/>
+          <w:numId w:val="2"/>
+        </w:numPr>
+        <w:spacing w:after="80"/>
+      </w:pPr>
+      <w:hyperlink w:history="1" r:id="rIdhpcepgdsflzjsnzjudk6z">
+        <w:r>
+          <w:rPr>
+            <w:rStyle w:val="Hyperlink"/>
+          </w:rPr>
+          <w:t xml:space="preserve">Epilog: laser marking anodized aluminium</w:t>
+        </w:r>
+      </w:hyperlink>
+    </w:p>
+    <w:p>
+      <w:pPr>
+        <w:pStyle w:val="ListParagraph"/>
+        <w:numPr>
+          <w:ilvl w:val="0"/>
+          <w:numId w:val="2"/>
+        </w:numPr>
+        <w:spacing w:after="80"/>
+      </w:pPr>
+      <w:hyperlink w:history="1" r:id="rIdwjtvnbtsb0gfe_uxbsmzj">
+        <w:r>
+          <w:rPr>
+            <w:rStyle w:val="Hyperlink"/>
+          </w:rPr>
+          <w:t xml:space="preserve">Express Corp: panels and overlays</w:t>
+        </w:r>
+      </w:hyperlink>
+    </w:p>
+    <w:p>
+      <w:pPr>
+        <w:pStyle w:val="ListParagraph"/>
+        <w:numPr>
+          <w:ilvl w:val="0"/>
+          <w:numId w:val="2"/>
+        </w:numPr>
+        <w:spacing w:after="80"/>
+      </w:pPr>
+      <w:hyperlink w:history="1" r:id="rIdbyzpgxj4b0mtn8dvbdvpt">
+        <w:r>
+          <w:rPr>
+            <w:rStyle w:val="Hyperlink"/>
+          </w:rPr>
+          <w:t xml:space="preserve">XK Display: graphic overlay guide</w:t>
+        </w:r>
+      </w:hyperlink>
+    </w:p>
+    <w:p>
+      <w:pPr>
         <w:pStyle w:val="Heading1"/>
       </w:pPr>
       <w:r>
@@ -1580,6 +4035,25 @@
           <w:b/>
           <w:bCs/>
         </w:rPr>
+        <w:t xml:space="preserve">Anodizing:</w:t>
+      </w:r>
+      <w:r>
+        <w:rPr>
+          <w:b w:val="false"/>
+          <w:bCs w:val="false"/>
+        </w:rPr>
+        <w:t xml:space="preserve"> a chemical process that thickens aluminium's surface layer, which can then be dyed a colour.</w:t>
+      </w:r>
+    </w:p>
+    <w:p>
+      <w:pPr>
+        <w:spacing w:after="120"/>
+      </w:pPr>
+      <w:r>
+        <w:rPr>
+          <w:b/>
+          <w:bCs/>
+        </w:rPr>
         <w:t xml:space="preserve">Centre-punch:</w:t>
       </w:r>
       <w:r>
@@ -1599,6 +4073,25 @@
           <w:b/>
           <w:bCs/>
         </w:rPr>
+        <w:t xml:space="preserve">CMYK:</w:t>
+      </w:r>
+      <w:r>
+        <w:rPr>
+          <w:b w:val="false"/>
+          <w:bCs w:val="false"/>
+        </w:rPr>
+        <w:t xml:space="preserve"> the four-ink colour system (cyan, magenta, yellow, black) that printers use, as opposed to the RGB colours of a screen.</w:t>
+      </w:r>
+    </w:p>
+    <w:p>
+      <w:pPr>
+        <w:spacing w:after="120"/>
+      </w:pPr>
+      <w:r>
+        <w:rPr>
+          <w:b/>
+          <w:bCs/>
+        </w:rPr>
         <w:t xml:space="preserve">CNC (computer numerical control):</w:t>
       </w:r>
       <w:r>
@@ -1675,6 +4168,25 @@
           <w:b/>
           <w:bCs/>
         </w:rPr>
+        <w:t xml:space="preserve">Graphic overlay:</w:t>
+      </w:r>
+      <w:r>
+        <w:rPr>
+          <w:b w:val="false"/>
+          <w:bCs w:val="false"/>
+        </w:rPr>
+        <w:t xml:space="preserve"> a thin printed plastic sheet, usually polycarbonate or polyester, with adhesive on the back. Common on equipment front panels.</w:t>
+      </w:r>
+    </w:p>
+    <w:p>
+      <w:pPr>
+        <w:spacing w:after="120"/>
+      </w:pPr>
+      <w:r>
+        <w:rPr>
+          <w:b/>
+          <w:bCs/>
+        </w:rPr>
         <w:t xml:space="preserve">Light pipe:</w:t>
       </w:r>
       <w:r>
@@ -1694,6 +4206,25 @@
           <w:b/>
           <w:bCs/>
         </w:rPr>
+        <w:t xml:space="preserve">Masking:</w:t>
+      </w:r>
+      <w:r>
+        <w:rPr>
+          <w:b w:val="false"/>
+          <w:bCs w:val="false"/>
+        </w:rPr>
+        <w:t xml:space="preserve"> covering part of a box before coating it, so that area stays as bare metal.</w:t>
+      </w:r>
+    </w:p>
+    <w:p>
+      <w:pPr>
+        <w:spacing w:after="120"/>
+      </w:pPr>
+      <w:r>
+        <w:rPr>
+          <w:b/>
+          <w:bCs/>
+        </w:rPr>
         <w:t xml:space="preserve">Pocket:</w:t>
       </w:r>
       <w:r>
@@ -1732,6 +4263,25 @@
           <w:b/>
           <w:bCs/>
         </w:rPr>
+        <w:t xml:space="preserve">Silvering:</w:t>
+      </w:r>
+      <w:r>
+        <w:rPr>
+          <w:b w:val="false"/>
+          <w:bCs w:val="false"/>
+        </w:rPr>
+        <w:t xml:space="preserve"> a cloudy, silvery look around a decal, caused by air trapped under the film.</w:t>
+      </w:r>
+    </w:p>
+    <w:p>
+      <w:pPr>
+        <w:spacing w:after="120"/>
+      </w:pPr>
+      <w:r>
+        <w:rPr>
+          <w:b/>
+          <w:bCs/>
+        </w:rPr>
         <w:t xml:space="preserve">Step bit:</w:t>
       </w:r>
       <w:r>
@@ -1770,6 +4320,25 @@
           <w:b/>
           <w:bCs/>
         </w:rPr>
+        <w:t xml:space="preserve">UV DTF (direct-to-film):</w:t>
+      </w:r>
+      <w:r>
+        <w:rPr>
+          <w:b w:val="false"/>
+          <w:bCs w:val="false"/>
+        </w:rPr>
+        <w:t xml:space="preserve"> a design printed with UV-hardened ink on a film, then transferred to a surface like a rub-on sticker.</w:t>
+      </w:r>
+    </w:p>
+    <w:p>
+      <w:pPr>
+        <w:spacing w:after="120"/>
+      </w:pPr>
+      <w:r>
+        <w:rPr>
+          <w:b/>
+          <w:bCs/>
+        </w:rPr>
         <w:t xml:space="preserve">UV printing:</w:t>
       </w:r>
       <w:r>
@@ -1778,6 +4347,44 @@
           <w:bCs w:val="false"/>
         </w:rPr>
         <w:t xml:space="preserve"> printing artwork directly onto the box with ink that is hardened by ultraviolet light.</w:t>
+      </w:r>
+    </w:p>
+    <w:p>
+      <w:pPr>
+        <w:spacing w:after="120"/>
+      </w:pPr>
+      <w:r>
+        <w:rPr>
+          <w:b/>
+          <w:bCs/>
+        </w:rPr>
+        <w:t xml:space="preserve">Vector artwork:</w:t>
+      </w:r>
+      <w:r>
+        <w:rPr>
+          <w:b w:val="false"/>
+          <w:bCs w:val="false"/>
+        </w:rPr>
+        <w:t xml:space="preserve"> a design stored as shapes rather than pixels, so it stays sharp at any size.</w:t>
+      </w:r>
+    </w:p>
+    <w:p>
+      <w:pPr>
+        <w:spacing w:after="120"/>
+      </w:pPr>
+      <w:r>
+        <w:rPr>
+          <w:b/>
+          <w:bCs/>
+        </w:rPr>
+        <w:t xml:space="preserve">Waterslide decal:</w:t>
+      </w:r>
+      <w:r>
+        <w:rPr>
+          <w:b w:val="false"/>
+          <w:bCs w:val="false"/>
+        </w:rPr>
+        <w:t xml:space="preserve"> a printed film on backing paper. Soaking it in water frees the film so it can be slid into place.</w:t>
       </w:r>
     </w:p>
     <w:sectPr>
@@ -1975,6 +4582,18 @@
     </w:lvl>
   </w:abstractNum>
   <w:abstractNum w:abstractNumId="4" w15:restartNumberingAfterBreak="0">
+    <w:multiLevelType w:val="hybridMultilevel"/>
+    <w:lvl w:ilvl="0" w:tentative="1">
+      <w:start w:val="1"/>
+      <w:numFmt w:val="decimal"/>
+      <w:lvlText w:val="%1."/>
+      <w:lvlJc w:val="left"/>
+      <w:pPr>
+        <w:ind w:left="420" w:hanging="300"/>
+      </w:pPr>
+    </w:lvl>
+  </w:abstractNum>
+  <w:abstractNum w:abstractNumId="5" w15:restartNumberingAfterBreak="0">
     <w:multiLevelType w:val="hybridMultilevel"/>
     <w:lvl w:ilvl="0" w:tentative="1">
       <w:start w:val="1"/>
@@ -2005,6 +4624,12 @@
     </w:lvlOverride>
   </w:num>
   <w:num w:numId="4">
+    <w:abstractNumId w:val="5"/>
+    <w:lvlOverride w:ilvl="0">
+      <w:startOverride w:val="1"/>
+    </w:lvlOverride>
+  </w:num>
+  <w:num w:numId="5">
     <w:abstractNumId w:val="4"/>
     <w:lvlOverride w:ilvl="0">
       <w:startOverride w:val="1"/>

</xml_diff>